<commit_message>
Update 20260319_길 연결 퍼즐 기획_moz.A.I.c_모으미_v2.02.docx
길 연결 퍼즐에 다시하기 기능 기획 추가
</commit_message>
<xml_diff>
--- a/Docs/Puzzle/4_길 연결 퍼즐/20260319_길 연결 퍼즐 기획_moz.A.I.c_모으미_v2.02.docx
+++ b/Docs/Puzzle/4_길 연결 퍼즐/20260319_길 연결 퍼즐 기획_moz.A.I.c_모으미_v2.02.docx
@@ -9,7 +9,6 @@
           <w:ilvl w:val="0"/>
           <w:numId w:val="1"/>
         </w:numPr>
-        <w:wordWrap w:val="0"/>
         <w:ind w:leftChars="0"/>
       </w:pPr>
       <w:r>
@@ -37,22 +36,9 @@
             <w:shd w:val="clear" w:color="auto" w:fill="8EAADB" w:themeFill="accent1" w:themeFillTint="99"/>
           </w:tcPr>
           <w:p>
-            <w:pPr>
-              <w:jc w:val="center"/>
-              <w:rPr>
-                <w:b/>
-                <w:bCs/>
-                <w:sz w:val="24"/>
-                <w:szCs w:val="24"/>
-              </w:rPr>
-            </w:pPr>
-            <w:r>
-              <w:rPr>
-                <w:rFonts w:hint="eastAsia"/>
-                <w:b/>
-                <w:bCs/>
-                <w:sz w:val="24"/>
-                <w:szCs w:val="24"/>
+            <w:r>
+              <w:rPr>
+                <w:rFonts w:hint="eastAsia"/>
               </w:rPr>
               <w:t>버전</w:t>
             </w:r>
@@ -64,22 +50,9 @@
             <w:shd w:val="clear" w:color="auto" w:fill="8EAADB" w:themeFill="accent1" w:themeFillTint="99"/>
           </w:tcPr>
           <w:p>
-            <w:pPr>
-              <w:jc w:val="center"/>
-              <w:rPr>
-                <w:b/>
-                <w:bCs/>
-                <w:sz w:val="24"/>
-                <w:szCs w:val="24"/>
-              </w:rPr>
-            </w:pPr>
-            <w:r>
-              <w:rPr>
-                <w:rFonts w:hint="eastAsia"/>
-                <w:b/>
-                <w:bCs/>
-                <w:sz w:val="24"/>
-                <w:szCs w:val="24"/>
+            <w:r>
+              <w:rPr>
+                <w:rFonts w:hint="eastAsia"/>
               </w:rPr>
               <w:t>업로드 일자</w:t>
             </w:r>
@@ -91,22 +64,9 @@
             <w:shd w:val="clear" w:color="auto" w:fill="8EAADB" w:themeFill="accent1" w:themeFillTint="99"/>
           </w:tcPr>
           <w:p>
-            <w:pPr>
-              <w:jc w:val="center"/>
-              <w:rPr>
-                <w:b/>
-                <w:bCs/>
-                <w:sz w:val="24"/>
-                <w:szCs w:val="24"/>
-              </w:rPr>
-            </w:pPr>
-            <w:r>
-              <w:rPr>
-                <w:rFonts w:hint="eastAsia"/>
-                <w:b/>
-                <w:bCs/>
-                <w:sz w:val="24"/>
-                <w:szCs w:val="24"/>
+            <w:r>
+              <w:rPr>
+                <w:rFonts w:hint="eastAsia"/>
               </w:rPr>
               <w:t>업데이트 내역</w:t>
             </w:r>
@@ -120,21 +80,10 @@
             <w:shd w:val="clear" w:color="auto" w:fill="D9E2F3" w:themeFill="accent1" w:themeFillTint="33"/>
           </w:tcPr>
           <w:p>
-            <w:pPr>
-              <w:rPr>
-                <w:sz w:val="22"/>
-              </w:rPr>
-            </w:pPr>
-            <w:r>
-              <w:rPr>
-                <w:sz w:val="22"/>
-              </w:rPr>
+            <w:r>
               <w:t>1</w:t>
             </w:r>
             <w:r>
-              <w:rPr>
-                <w:sz w:val="22"/>
-              </w:rPr>
               <w:t>.00</w:t>
             </w:r>
           </w:p>
@@ -185,27 +134,13 @@
             <w:shd w:val="clear" w:color="auto" w:fill="D9E2F3" w:themeFill="accent1" w:themeFillTint="33"/>
           </w:tcPr>
           <w:p>
-            <w:pPr>
-              <w:rPr>
-                <w:sz w:val="22"/>
-              </w:rPr>
-            </w:pPr>
-            <w:r>
-              <w:rPr>
-                <w:sz w:val="22"/>
-              </w:rPr>
+            <w:r>
               <w:t>2</w:t>
             </w:r>
             <w:r>
-              <w:rPr>
-                <w:sz w:val="22"/>
-              </w:rPr>
               <w:t>.</w:t>
             </w:r>
             <w:r>
-              <w:rPr>
-                <w:sz w:val="22"/>
-              </w:rPr>
               <w:t>00</w:t>
             </w:r>
           </w:p>
@@ -247,22 +182,13 @@
             <w:shd w:val="clear" w:color="auto" w:fill="D9E2F3" w:themeFill="accent1" w:themeFillTint="33"/>
           </w:tcPr>
           <w:p>
-            <w:pPr>
-              <w:rPr>
-                <w:sz w:val="22"/>
-              </w:rPr>
-            </w:pPr>
-            <w:r>
-              <w:rPr>
-                <w:rFonts w:hint="eastAsia"/>
-                <w:sz w:val="22"/>
+            <w:r>
+              <w:rPr>
+                <w:rFonts w:hint="eastAsia"/>
               </w:rPr>
               <w:t>2</w:t>
             </w:r>
             <w:r>
-              <w:rPr>
-                <w:sz w:val="22"/>
-              </w:rPr>
               <w:t>.01</w:t>
             </w:r>
           </w:p>
@@ -304,22 +230,13 @@
             <w:shd w:val="clear" w:color="auto" w:fill="D9E2F3" w:themeFill="accent1" w:themeFillTint="33"/>
           </w:tcPr>
           <w:p>
-            <w:pPr>
-              <w:rPr>
-                <w:sz w:val="22"/>
-              </w:rPr>
-            </w:pPr>
-            <w:r>
-              <w:rPr>
-                <w:rFonts w:hint="eastAsia"/>
-                <w:sz w:val="22"/>
+            <w:r>
+              <w:rPr>
+                <w:rFonts w:hint="eastAsia"/>
               </w:rPr>
               <w:t>2</w:t>
             </w:r>
             <w:r>
-              <w:rPr>
-                <w:sz w:val="22"/>
-              </w:rPr>
               <w:t>.02</w:t>
             </w:r>
           </w:p>
@@ -345,11 +262,15 @@
             <w:tcW w:w="7803" w:type="dxa"/>
           </w:tcPr>
           <w:p>
-            <w:pPr>
-              <w:rPr>
-                <w:rFonts w:hint="eastAsia"/>
-              </w:rPr>
-            </w:pPr>
+            <w:r>
+              <w:t>플레이</w:t>
+            </w:r>
+            <w:r>
+              <w:rPr>
+                <w:rFonts w:hint="eastAsia"/>
+              </w:rPr>
+              <w:t xml:space="preserve"> 다시하기 기능 추가</w:t>
+            </w:r>
           </w:p>
         </w:tc>
       </w:tr>
@@ -359,13 +280,7 @@
             <w:tcW w:w="1250" w:type="dxa"/>
             <w:shd w:val="clear" w:color="auto" w:fill="D9E2F3" w:themeFill="accent1" w:themeFillTint="33"/>
           </w:tcPr>
-          <w:p>
-            <w:pPr>
-              <w:rPr>
-                <w:sz w:val="22"/>
-              </w:rPr>
-            </w:pPr>
-          </w:p>
+          <w:p/>
         </w:tc>
         <w:tc>
           <w:tcPr>
@@ -383,13 +298,6 @@
     </w:tbl>
     <w:p/>
     <w:p>
-      <w:pPr>
-        <w:widowControl/>
-        <w:wordWrap/>
-        <w:autoSpaceDE/>
-        <w:autoSpaceDN/>
-        <w:spacing w:line="259" w:lineRule="auto"/>
-      </w:pPr>
       <w:r>
         <w:br w:type="page"/>
       </w:r>
@@ -397,18 +305,16 @@
     <w:p>
       <w:pPr>
         <w:pStyle w:val="1"/>
+        <w:numPr>
+          <w:ilvl w:val="0"/>
+          <w:numId w:val="5"/>
+        </w:numPr>
       </w:pPr>
       <w:r>
         <w:rPr>
           <w:rFonts w:hint="eastAsia"/>
         </w:rPr>
         <w:lastRenderedPageBreak/>
-        <w:t xml:space="preserve">1. </w:t>
-      </w:r>
-      <w:r>
-        <w:rPr>
-          <w:rFonts w:hint="eastAsia"/>
-        </w:rPr>
         <w:t>퍼즐</w:t>
       </w:r>
       <w:r>
@@ -419,9 +325,6 @@
       </w:r>
     </w:p>
     <w:p>
-      <w:pPr>
-        <w:spacing w:after="0" w:line="240" w:lineRule="auto"/>
-      </w:pPr>
       <w:r>
         <w:rPr>
           <w:rFonts w:hint="eastAsia"/>
@@ -471,24 +374,15 @@
         <w:t xml:space="preserve"> 완료할 수 있다.</w:t>
       </w:r>
     </w:p>
+    <w:p/>
     <w:p>
       <w:pPr>
-        <w:spacing w:after="0" w:line="240" w:lineRule="auto"/>
-      </w:pPr>
-    </w:p>
-    <w:p>
-      <w:pPr>
         <w:pStyle w:val="1"/>
-      </w:pPr>
-      <w:r>
-        <w:rPr>
-          <w:rFonts w:hint="eastAsia"/>
-        </w:rPr>
-        <w:t>2</w:t>
-      </w:r>
-      <w:r>
-        <w:t xml:space="preserve">. </w:t>
-      </w:r>
+        <w:numPr>
+          <w:ilvl w:val="0"/>
+          <w:numId w:val="5"/>
+        </w:numPr>
+      </w:pPr>
       <w:r>
         <w:rPr>
           <w:rFonts w:hint="eastAsia"/>
@@ -529,7 +423,6 @@
           <w:ilvl w:val="0"/>
           <w:numId w:val="1"/>
         </w:numPr>
-        <w:wordWrap w:val="0"/>
         <w:ind w:leftChars="0"/>
       </w:pPr>
       <w:r>
@@ -549,7 +442,6 @@
           <w:ilvl w:val="1"/>
           <w:numId w:val="1"/>
         </w:numPr>
-        <w:wordWrap w:val="0"/>
         <w:ind w:leftChars="0"/>
       </w:pPr>
       <w:r>
@@ -566,7 +458,6 @@
           <w:ilvl w:val="1"/>
           <w:numId w:val="1"/>
         </w:numPr>
-        <w:wordWrap w:val="0"/>
         <w:ind w:leftChars="0"/>
       </w:pPr>
       <w:r>
@@ -592,7 +483,6 @@
           <w:ilvl w:val="0"/>
           <w:numId w:val="1"/>
         </w:numPr>
-        <w:wordWrap w:val="0"/>
         <w:ind w:leftChars="0"/>
       </w:pPr>
       <w:r>
@@ -654,7 +544,6 @@
           <w:ilvl w:val="0"/>
           <w:numId w:val="1"/>
         </w:numPr>
-        <w:wordWrap w:val="0"/>
         <w:ind w:leftChars="0"/>
       </w:pPr>
       <w:r>
@@ -719,7 +608,6 @@
           <w:ilvl w:val="1"/>
           <w:numId w:val="1"/>
         </w:numPr>
-        <w:wordWrap w:val="0"/>
         <w:ind w:leftChars="0"/>
       </w:pPr>
       <w:r>
@@ -796,7 +684,6 @@
           <w:ilvl w:val="2"/>
           <w:numId w:val="1"/>
         </w:numPr>
-        <w:wordWrap w:val="0"/>
         <w:ind w:leftChars="0"/>
       </w:pPr>
       <w:r>
@@ -866,7 +753,6 @@
           <w:ilvl w:val="1"/>
           <w:numId w:val="1"/>
         </w:numPr>
-        <w:wordWrap w:val="0"/>
         <w:ind w:leftChars="0"/>
       </w:pPr>
       <w:r>
@@ -957,9 +843,6 @@
             <w:vAlign w:val="center"/>
           </w:tcPr>
           <w:p>
-            <w:pPr>
-              <w:jc w:val="center"/>
-            </w:pPr>
             <w:r>
               <w:rPr>
                 <w:rFonts w:hint="eastAsia"/>
@@ -978,9 +861,6 @@
             <w:vAlign w:val="center"/>
           </w:tcPr>
           <w:p>
-            <w:pPr>
-              <w:jc w:val="center"/>
-            </w:pPr>
             <w:r>
               <w:rPr>
                 <w:rFonts w:hint="eastAsia"/>
@@ -999,9 +879,6 @@
             <w:vAlign w:val="center"/>
           </w:tcPr>
           <w:p>
-            <w:pPr>
-              <w:jc w:val="center"/>
-            </w:pPr>
             <w:r>
               <w:rPr>
                 <w:rFonts w:hint="eastAsia"/>
@@ -1024,11 +901,7 @@
             <w:vMerge/>
             <w:vAlign w:val="center"/>
           </w:tcPr>
-          <w:p>
-            <w:pPr>
-              <w:jc w:val="center"/>
-            </w:pPr>
-          </w:p>
+          <w:p/>
         </w:tc>
         <w:tc>
           <w:tcPr>
@@ -1036,9 +909,6 @@
             <w:vAlign w:val="center"/>
           </w:tcPr>
           <w:p>
-            <w:pPr>
-              <w:jc w:val="center"/>
-            </w:pPr>
             <w:r>
               <w:rPr>
                 <w:rFonts w:hint="eastAsia"/>
@@ -1056,9 +926,6 @@
             <w:vAlign w:val="center"/>
           </w:tcPr>
           <w:p>
-            <w:pPr>
-              <w:jc w:val="center"/>
-            </w:pPr>
             <w:r>
               <w:rPr>
                 <w:rFonts w:hint="eastAsia"/>
@@ -1076,9 +943,6 @@
             <w:vAlign w:val="center"/>
           </w:tcPr>
           <w:p>
-            <w:pPr>
-              <w:jc w:val="center"/>
-            </w:pPr>
             <w:r>
               <w:rPr>
                 <w:rFonts w:hint="eastAsia"/>
@@ -1096,9 +960,6 @@
             <w:vAlign w:val="center"/>
           </w:tcPr>
           <w:p>
-            <w:pPr>
-              <w:jc w:val="center"/>
-            </w:pPr>
             <w:r>
               <w:rPr>
                 <w:rFonts w:hint="eastAsia"/>
@@ -1121,9 +982,6 @@
             <w:vAlign w:val="center"/>
           </w:tcPr>
           <w:p>
-            <w:pPr>
-              <w:jc w:val="center"/>
-            </w:pPr>
             <w:r>
               <w:rPr>
                 <w:rFonts w:hint="eastAsia"/>
@@ -1141,9 +999,6 @@
             <w:vAlign w:val="center"/>
           </w:tcPr>
           <w:p>
-            <w:pPr>
-              <w:jc w:val="center"/>
-            </w:pPr>
             <w:r>
               <w:rPr>
                 <w:rFonts w:hint="eastAsia"/>
@@ -1162,9 +1017,6 @@
             <w:vAlign w:val="center"/>
           </w:tcPr>
           <w:p>
-            <w:pPr>
-              <w:jc w:val="center"/>
-            </w:pPr>
             <w:r>
               <w:rPr>
                 <w:rFonts w:hint="eastAsia"/>
@@ -1183,9 +1035,6 @@
             <w:vAlign w:val="center"/>
           </w:tcPr>
           <w:p>
-            <w:pPr>
-              <w:jc w:val="center"/>
-            </w:pPr>
             <w:r>
               <w:rPr>
                 <w:rFonts w:hint="eastAsia"/>
@@ -1204,9 +1053,6 @@
             <w:vAlign w:val="center"/>
           </w:tcPr>
           <w:p>
-            <w:pPr>
-              <w:jc w:val="center"/>
-            </w:pPr>
             <w:r>
               <w:rPr>
                 <w:rFonts w:hint="eastAsia"/>
@@ -1229,9 +1075,6 @@
             <w:vAlign w:val="center"/>
           </w:tcPr>
           <w:p>
-            <w:pPr>
-              <w:jc w:val="center"/>
-            </w:pPr>
             <w:r>
               <w:rPr>
                 <w:rFonts w:hint="eastAsia"/>
@@ -1250,9 +1093,6 @@
             <w:vAlign w:val="center"/>
           </w:tcPr>
           <w:p>
-            <w:pPr>
-              <w:jc w:val="center"/>
-            </w:pPr>
             <w:r>
               <w:rPr>
                 <w:rFonts w:hint="eastAsia"/>
@@ -1271,9 +1111,6 @@
             <w:vAlign w:val="center"/>
           </w:tcPr>
           <w:p>
-            <w:pPr>
-              <w:jc w:val="center"/>
-            </w:pPr>
             <w:r>
               <w:rPr>
                 <w:rFonts w:hint="eastAsia"/>
@@ -1292,9 +1129,6 @@
             <w:vAlign w:val="center"/>
           </w:tcPr>
           <w:p>
-            <w:pPr>
-              <w:jc w:val="center"/>
-            </w:pPr>
             <w:r>
               <w:rPr>
                 <w:rFonts w:hint="eastAsia"/>
@@ -1313,9 +1147,6 @@
             <w:vAlign w:val="center"/>
           </w:tcPr>
           <w:p>
-            <w:pPr>
-              <w:jc w:val="center"/>
-            </w:pPr>
             <w:r>
               <w:rPr>
                 <w:rFonts w:hint="eastAsia"/>
@@ -1336,7 +1167,6 @@
           <w:ilvl w:val="2"/>
           <w:numId w:val="1"/>
         </w:numPr>
-        <w:wordWrap w:val="0"/>
         <w:ind w:leftChars="0"/>
       </w:pPr>
       <w:r>
@@ -1389,7 +1219,6 @@
           <w:ilvl w:val="1"/>
           <w:numId w:val="1"/>
         </w:numPr>
-        <w:wordWrap w:val="0"/>
         <w:ind w:leftChars="0"/>
       </w:pPr>
       <w:r>
@@ -1427,7 +1256,6 @@
           <w:ilvl w:val="2"/>
           <w:numId w:val="1"/>
         </w:numPr>
-        <w:wordWrap w:val="0"/>
         <w:ind w:leftChars="0"/>
       </w:pPr>
       <w:r>
@@ -1444,7 +1272,6 @@
           <w:ilvl w:val="0"/>
           <w:numId w:val="1"/>
         </w:numPr>
-        <w:wordWrap w:val="0"/>
         <w:ind w:leftChars="0"/>
       </w:pPr>
       <w:r>
@@ -1481,10 +1308,6 @@
       </w:r>
     </w:p>
     <w:p>
-      <w:pPr>
-        <w:spacing w:after="0"/>
-        <w:jc w:val="center"/>
-      </w:pPr>
       <w:r>
         <w:rPr>
           <w:noProof/>
@@ -1533,7 +1356,6 @@
           <w:ilvl w:val="1"/>
           <w:numId w:val="1"/>
         </w:numPr>
-        <w:wordWrap w:val="0"/>
         <w:ind w:leftChars="0"/>
       </w:pPr>
       <w:r>
@@ -1615,7 +1437,6 @@
           <w:ilvl w:val="1"/>
           <w:numId w:val="1"/>
         </w:numPr>
-        <w:wordWrap w:val="0"/>
         <w:ind w:leftChars="0"/>
       </w:pPr>
       <w:r>
@@ -1658,7 +1479,6 @@
           <w:ilvl w:val="0"/>
           <w:numId w:val="1"/>
         </w:numPr>
-        <w:wordWrap w:val="0"/>
         <w:ind w:leftChars="0"/>
       </w:pPr>
       <w:r>
@@ -1675,7 +1495,6 @@
           <w:ilvl w:val="1"/>
           <w:numId w:val="1"/>
         </w:numPr>
-        <w:wordWrap w:val="0"/>
         <w:ind w:leftChars="0"/>
       </w:pPr>
       <w:r>
@@ -1701,7 +1520,6 @@
           <w:ilvl w:val="1"/>
           <w:numId w:val="1"/>
         </w:numPr>
-        <w:wordWrap w:val="0"/>
         <w:ind w:leftChars="0"/>
       </w:pPr>
       <w:r>
@@ -1724,64 +1542,53 @@
           <w:rFonts w:hint="eastAsia"/>
         </w:rPr>
         <w:t>를 출력한다.</w:t>
+      </w:r>
+    </w:p>
+    <w:p/>
+    <w:p/>
+    <w:p>
+      <w:pPr>
+        <w:pStyle w:val="2"/>
+      </w:pPr>
+      <w:r>
+        <w:rPr>
+          <w:rFonts w:hint="eastAsia"/>
+        </w:rPr>
+        <w:lastRenderedPageBreak/>
+        <w:t>2</w:t>
+      </w:r>
+      <w:r>
+        <w:t>-</w:t>
+      </w:r>
+      <w:r>
+        <w:t>2</w:t>
+      </w:r>
+      <w:r>
+        <w:t>. 스위치</w:t>
+      </w:r>
+      <w:r>
+        <w:rPr>
+          <w:rFonts w:hint="eastAsia"/>
+        </w:rPr>
+        <w:t xml:space="preserve"> </w:t>
+      </w:r>
+      <w:r>
+        <w:rPr>
+          <w:rFonts w:hint="eastAsia"/>
+        </w:rPr>
+        <w:t>상호작용</w:t>
+      </w:r>
+      <w:r>
+        <w:rPr>
+          <w:rFonts w:hint="eastAsia"/>
+        </w:rPr>
+        <w:t xml:space="preserve"> </w:t>
+      </w:r>
+      <w:r>
+        <w:t>규칙</w:t>
       </w:r>
     </w:p>
     <w:p>
-      <w:pPr>
-        <w:spacing w:after="0"/>
-      </w:pPr>
-    </w:p>
-    <w:p>
-      <w:pPr>
-        <w:spacing w:after="0"/>
-      </w:pPr>
-    </w:p>
-    <w:p>
-      <w:pPr>
-        <w:pStyle w:val="2"/>
-      </w:pPr>
-      <w:r>
-        <w:rPr>
-          <w:rFonts w:hint="eastAsia"/>
-        </w:rPr>
-        <w:lastRenderedPageBreak/>
-        <w:t>2</w:t>
-      </w:r>
-      <w:r>
-        <w:t>-</w:t>
-      </w:r>
-      <w:r>
-        <w:t>2</w:t>
-      </w:r>
-      <w:r>
-        <w:t>. 스위치</w:t>
-      </w:r>
-      <w:r>
-        <w:rPr>
-          <w:rFonts w:hint="eastAsia"/>
-        </w:rPr>
-        <w:t xml:space="preserve"> </w:t>
-      </w:r>
-      <w:r>
-        <w:rPr>
-          <w:rFonts w:hint="eastAsia"/>
-        </w:rPr>
-        <w:t>상호작용</w:t>
-      </w:r>
-      <w:r>
-        <w:rPr>
-          <w:rFonts w:hint="eastAsia"/>
-        </w:rPr>
-        <w:t xml:space="preserve"> </w:t>
-      </w:r>
-      <w:r>
-        <w:t>규칙</w:t>
-      </w:r>
-    </w:p>
-    <w:p>
-      <w:pPr>
-        <w:spacing w:after="0"/>
-      </w:pPr>
       <w:r>
         <w:rPr>
           <w:rFonts w:hint="eastAsia"/>
@@ -1850,7 +1657,6 @@
           <w:ilvl w:val="0"/>
           <w:numId w:val="1"/>
         </w:numPr>
-        <w:wordWrap w:val="0"/>
         <w:ind w:leftChars="0"/>
       </w:pPr>
       <w:r>
@@ -1909,7 +1715,6 @@
           <w:ilvl w:val="0"/>
           <w:numId w:val="1"/>
         </w:numPr>
-        <w:wordWrap w:val="0"/>
         <w:ind w:leftChars="0"/>
       </w:pPr>
       <w:r>
@@ -1973,25 +1778,15 @@
             <w:shd w:val="clear" w:color="auto" w:fill="BDD6EE" w:themeFill="accent5" w:themeFillTint="66"/>
           </w:tcPr>
           <w:p>
-            <w:pPr>
-              <w:rPr>
-                <w:b/>
-                <w:bCs/>
-              </w:rPr>
-            </w:pPr>
-            <w:r>
-              <w:rPr>
-                <w:rFonts w:hint="eastAsia"/>
-                <w:b/>
-                <w:bCs/>
+            <w:r>
+              <w:rPr>
+                <w:rFonts w:hint="eastAsia"/>
               </w:rPr>
               <w:t>조건</w:t>
             </w:r>
             <w:r>
               <w:rPr>
                 <w:rFonts w:hint="eastAsia"/>
-                <w:b/>
-                <w:bCs/>
               </w:rPr>
               <w:t xml:space="preserve"> 종류</w:t>
             </w:r>
@@ -2003,17 +1798,9 @@
             <w:shd w:val="clear" w:color="auto" w:fill="BDD6EE" w:themeFill="accent5" w:themeFillTint="66"/>
           </w:tcPr>
           <w:p>
-            <w:pPr>
-              <w:rPr>
-                <w:b/>
-                <w:bCs/>
-              </w:rPr>
-            </w:pPr>
-            <w:r>
-              <w:rPr>
-                <w:rFonts w:hint="eastAsia"/>
-                <w:b/>
-                <w:bCs/>
+            <w:r>
+              <w:rPr>
+                <w:rFonts w:hint="eastAsia"/>
               </w:rPr>
               <w:t>동작 설명</w:t>
             </w:r>
@@ -2290,7 +2077,6 @@
           <w:ilvl w:val="0"/>
           <w:numId w:val="1"/>
         </w:numPr>
-        <w:wordWrap w:val="0"/>
         <w:ind w:leftChars="0"/>
       </w:pPr>
       <w:r>
@@ -2355,7 +2141,6 @@
           <w:ilvl w:val="1"/>
           <w:numId w:val="1"/>
         </w:numPr>
-        <w:wordWrap w:val="0"/>
         <w:ind w:leftChars="0"/>
       </w:pPr>
       <w:r>
@@ -2416,26 +2201,13 @@
             <w:shd w:val="clear" w:color="auto" w:fill="BDD6EE" w:themeFill="accent5" w:themeFillTint="66"/>
           </w:tcPr>
           <w:p>
-            <w:pPr>
-              <w:jc w:val="center"/>
-              <w:rPr>
-                <w:b/>
-                <w:bCs/>
-              </w:rPr>
-            </w:pPr>
-            <w:r>
-              <w:rPr>
-                <w:rFonts w:hint="eastAsia"/>
-                <w:b/>
-                <w:bCs/>
+            <w:r>
+              <w:rPr>
+                <w:rFonts w:hint="eastAsia"/>
               </w:rPr>
               <w:t>v</w:t>
             </w:r>
             <w:r>
-              <w:rPr>
-                <w:b/>
-                <w:bCs/>
-              </w:rPr>
               <w:t>alue</w:t>
             </w:r>
           </w:p>
@@ -2446,18 +2218,9 @@
             <w:shd w:val="clear" w:color="auto" w:fill="BDD6EE" w:themeFill="accent5" w:themeFillTint="66"/>
           </w:tcPr>
           <w:p>
-            <w:pPr>
-              <w:jc w:val="center"/>
-              <w:rPr>
-                <w:b/>
-                <w:bCs/>
-              </w:rPr>
-            </w:pPr>
-            <w:r>
-              <w:rPr>
-                <w:rFonts w:hint="eastAsia"/>
-                <w:b/>
-                <w:bCs/>
+            <w:r>
+              <w:rPr>
+                <w:rFonts w:hint="eastAsia"/>
               </w:rPr>
               <w:t>0</w:t>
             </w:r>
@@ -2469,18 +2232,9 @@
             <w:shd w:val="clear" w:color="auto" w:fill="BDD6EE" w:themeFill="accent5" w:themeFillTint="66"/>
           </w:tcPr>
           <w:p>
-            <w:pPr>
-              <w:jc w:val="center"/>
-              <w:rPr>
-                <w:b/>
-                <w:bCs/>
-              </w:rPr>
-            </w:pPr>
-            <w:r>
-              <w:rPr>
-                <w:rFonts w:hint="eastAsia"/>
-                <w:b/>
-                <w:bCs/>
+            <w:r>
+              <w:rPr>
+                <w:rFonts w:hint="eastAsia"/>
               </w:rPr>
               <w:t>1</w:t>
             </w:r>
@@ -2492,18 +2246,9 @@
             <w:shd w:val="clear" w:color="auto" w:fill="BDD6EE" w:themeFill="accent5" w:themeFillTint="66"/>
           </w:tcPr>
           <w:p>
-            <w:pPr>
-              <w:jc w:val="center"/>
-              <w:rPr>
-                <w:b/>
-                <w:bCs/>
-              </w:rPr>
-            </w:pPr>
-            <w:r>
-              <w:rPr>
-                <w:rFonts w:hint="eastAsia"/>
-                <w:b/>
-                <w:bCs/>
+            <w:r>
+              <w:rPr>
+                <w:rFonts w:hint="eastAsia"/>
               </w:rPr>
               <w:t>2</w:t>
             </w:r>
@@ -2515,18 +2260,9 @@
             <w:shd w:val="clear" w:color="auto" w:fill="BDD6EE" w:themeFill="accent5" w:themeFillTint="66"/>
           </w:tcPr>
           <w:p>
-            <w:pPr>
-              <w:jc w:val="center"/>
-              <w:rPr>
-                <w:b/>
-                <w:bCs/>
-              </w:rPr>
-            </w:pPr>
-            <w:r>
-              <w:rPr>
-                <w:rFonts w:hint="eastAsia"/>
-                <w:b/>
-                <w:bCs/>
+            <w:r>
+              <w:rPr>
+                <w:rFonts w:hint="eastAsia"/>
               </w:rPr>
               <w:t>3</w:t>
             </w:r>
@@ -2538,18 +2274,9 @@
             <w:shd w:val="clear" w:color="auto" w:fill="BDD6EE" w:themeFill="accent5" w:themeFillTint="66"/>
           </w:tcPr>
           <w:p>
-            <w:pPr>
-              <w:jc w:val="center"/>
-              <w:rPr>
-                <w:b/>
-                <w:bCs/>
-              </w:rPr>
-            </w:pPr>
-            <w:r>
-              <w:rPr>
-                <w:rFonts w:hint="eastAsia"/>
-                <w:b/>
-                <w:bCs/>
+            <w:r>
+              <w:rPr>
+                <w:rFonts w:hint="eastAsia"/>
               </w:rPr>
               <w:t>4</w:t>
             </w:r>
@@ -2561,18 +2288,9 @@
             <w:shd w:val="clear" w:color="auto" w:fill="BDD6EE" w:themeFill="accent5" w:themeFillTint="66"/>
           </w:tcPr>
           <w:p>
-            <w:pPr>
-              <w:jc w:val="center"/>
-              <w:rPr>
-                <w:b/>
-                <w:bCs/>
-              </w:rPr>
-            </w:pPr>
-            <w:r>
-              <w:rPr>
-                <w:rFonts w:hint="eastAsia"/>
-                <w:b/>
-                <w:bCs/>
+            <w:r>
+              <w:rPr>
+                <w:rFonts w:hint="eastAsia"/>
               </w:rPr>
               <w:t>5</w:t>
             </w:r>
@@ -2584,18 +2302,9 @@
             <w:shd w:val="clear" w:color="auto" w:fill="BDD6EE" w:themeFill="accent5" w:themeFillTint="66"/>
           </w:tcPr>
           <w:p>
-            <w:pPr>
-              <w:jc w:val="center"/>
-              <w:rPr>
-                <w:b/>
-                <w:bCs/>
-              </w:rPr>
-            </w:pPr>
-            <w:r>
-              <w:rPr>
-                <w:rFonts w:hint="eastAsia"/>
-                <w:b/>
-                <w:bCs/>
+            <w:r>
+              <w:rPr>
+                <w:rFonts w:hint="eastAsia"/>
               </w:rPr>
               <w:t>6</w:t>
             </w:r>
@@ -2607,18 +2316,9 @@
             <w:shd w:val="clear" w:color="auto" w:fill="BDD6EE" w:themeFill="accent5" w:themeFillTint="66"/>
           </w:tcPr>
           <w:p>
-            <w:pPr>
-              <w:jc w:val="center"/>
-              <w:rPr>
-                <w:b/>
-                <w:bCs/>
-              </w:rPr>
-            </w:pPr>
-            <w:r>
-              <w:rPr>
-                <w:rFonts w:hint="eastAsia"/>
-                <w:b/>
-                <w:bCs/>
+            <w:r>
+              <w:rPr>
+                <w:rFonts w:hint="eastAsia"/>
               </w:rPr>
               <w:t>7</w:t>
             </w:r>
@@ -2631,9 +2331,6 @@
             <w:tcW w:w="876" w:type="dxa"/>
           </w:tcPr>
           <w:p>
-            <w:pPr>
-              <w:jc w:val="center"/>
-            </w:pPr>
             <w:r>
               <w:rPr>
                 <w:rFonts w:hint="eastAsia"/>
@@ -2647,9 +2344,6 @@
             <w:tcW w:w="1217" w:type="dxa"/>
           </w:tcPr>
           <w:p>
-            <w:pPr>
-              <w:jc w:val="center"/>
-            </w:pPr>
             <w:r>
               <w:rPr>
                 <w:rFonts w:hint="eastAsia"/>
@@ -2666,9 +2360,6 @@
             <w:tcW w:w="1239" w:type="dxa"/>
           </w:tcPr>
           <w:p>
-            <w:pPr>
-              <w:jc w:val="center"/>
-            </w:pPr>
             <w:r>
               <w:rPr>
                 <w:rFonts w:hint="eastAsia"/>
@@ -2685,9 +2376,6 @@
             <w:tcW w:w="1238" w:type="dxa"/>
           </w:tcPr>
           <w:p>
-            <w:pPr>
-              <w:jc w:val="center"/>
-            </w:pPr>
             <w:r>
               <w:rPr>
                 <w:rFonts w:hint="eastAsia"/>
@@ -2704,9 +2392,6 @@
             <w:tcW w:w="1238" w:type="dxa"/>
           </w:tcPr>
           <w:p>
-            <w:pPr>
-              <w:jc w:val="center"/>
-            </w:pPr>
             <w:r>
               <w:rPr>
                 <w:rFonts w:hint="eastAsia"/>
@@ -2723,9 +2408,6 @@
             <w:tcW w:w="1238" w:type="dxa"/>
           </w:tcPr>
           <w:p>
-            <w:pPr>
-              <w:jc w:val="center"/>
-            </w:pPr>
             <w:r>
               <w:rPr>
                 <w:rFonts w:hint="eastAsia"/>
@@ -2742,9 +2424,6 @@
             <w:tcW w:w="1238" w:type="dxa"/>
           </w:tcPr>
           <w:p>
-            <w:pPr>
-              <w:jc w:val="center"/>
-            </w:pPr>
             <w:r>
               <w:rPr>
                 <w:rFonts w:hint="eastAsia"/>
@@ -2761,9 +2440,6 @@
             <w:tcW w:w="1239" w:type="dxa"/>
           </w:tcPr>
           <w:p>
-            <w:pPr>
-              <w:jc w:val="center"/>
-            </w:pPr>
             <w:r>
               <w:rPr>
                 <w:rFonts w:hint="eastAsia"/>
@@ -2780,9 +2456,6 @@
             <w:tcW w:w="1239" w:type="dxa"/>
           </w:tcPr>
           <w:p>
-            <w:pPr>
-              <w:jc w:val="center"/>
-            </w:pPr>
             <w:r>
               <w:rPr>
                 <w:rFonts w:hint="eastAsia"/>
@@ -2801,9 +2474,6 @@
             <w:tcW w:w="876" w:type="dxa"/>
           </w:tcPr>
           <w:p>
-            <w:pPr>
-              <w:jc w:val="center"/>
-            </w:pPr>
             <w:r>
               <w:rPr>
                 <w:rFonts w:hint="eastAsia"/>
@@ -2817,9 +2487,6 @@
             <w:tcW w:w="1217" w:type="dxa"/>
           </w:tcPr>
           <w:p>
-            <w:pPr>
-              <w:jc w:val="center"/>
-            </w:pPr>
             <w:r>
               <w:rPr>
                 <w:rFonts w:hint="eastAsia"/>
@@ -2836,9 +2503,6 @@
             <w:tcW w:w="1239" w:type="dxa"/>
           </w:tcPr>
           <w:p>
-            <w:pPr>
-              <w:jc w:val="center"/>
-            </w:pPr>
             <w:r>
               <w:rPr>
                 <w:rFonts w:hint="eastAsia"/>
@@ -2855,9 +2519,6 @@
             <w:tcW w:w="1238" w:type="dxa"/>
           </w:tcPr>
           <w:p>
-            <w:pPr>
-              <w:jc w:val="center"/>
-            </w:pPr>
             <w:r>
               <w:rPr>
                 <w:rFonts w:hint="eastAsia"/>
@@ -2874,9 +2535,6 @@
             <w:tcW w:w="1238" w:type="dxa"/>
           </w:tcPr>
           <w:p>
-            <w:pPr>
-              <w:jc w:val="center"/>
-            </w:pPr>
             <w:r>
               <w:rPr>
                 <w:rFonts w:hint="eastAsia"/>
@@ -2893,9 +2551,6 @@
             <w:tcW w:w="1238" w:type="dxa"/>
           </w:tcPr>
           <w:p>
-            <w:pPr>
-              <w:jc w:val="center"/>
-            </w:pPr>
             <w:r>
               <w:rPr>
                 <w:rFonts w:hint="eastAsia"/>
@@ -2912,9 +2567,6 @@
             <w:tcW w:w="1238" w:type="dxa"/>
           </w:tcPr>
           <w:p>
-            <w:pPr>
-              <w:jc w:val="center"/>
-            </w:pPr>
             <w:r>
               <w:rPr>
                 <w:rFonts w:hint="eastAsia"/>
@@ -2931,9 +2583,6 @@
             <w:tcW w:w="1239" w:type="dxa"/>
           </w:tcPr>
           <w:p>
-            <w:pPr>
-              <w:jc w:val="center"/>
-            </w:pPr>
             <w:r>
               <w:rPr>
                 <w:rFonts w:hint="eastAsia"/>
@@ -2950,9 +2599,6 @@
             <w:tcW w:w="1239" w:type="dxa"/>
           </w:tcPr>
           <w:p>
-            <w:pPr>
-              <w:jc w:val="center"/>
-            </w:pPr>
             <w:r>
               <w:rPr>
                 <w:rFonts w:hint="eastAsia"/>
@@ -2971,9 +2617,6 @@
             <w:tcW w:w="876" w:type="dxa"/>
           </w:tcPr>
           <w:p>
-            <w:pPr>
-              <w:jc w:val="center"/>
-            </w:pPr>
             <w:r>
               <w:rPr>
                 <w:rFonts w:hint="eastAsia"/>
@@ -2987,9 +2630,6 @@
             <w:tcW w:w="1217" w:type="dxa"/>
           </w:tcPr>
           <w:p>
-            <w:pPr>
-              <w:jc w:val="center"/>
-            </w:pPr>
             <w:r>
               <w:rPr>
                 <w:rFonts w:hint="eastAsia"/>
@@ -3006,9 +2646,6 @@
             <w:tcW w:w="1239" w:type="dxa"/>
           </w:tcPr>
           <w:p>
-            <w:pPr>
-              <w:jc w:val="center"/>
-            </w:pPr>
             <w:r>
               <w:rPr>
                 <w:rFonts w:hint="eastAsia"/>
@@ -3025,9 +2662,6 @@
             <w:tcW w:w="1238" w:type="dxa"/>
           </w:tcPr>
           <w:p>
-            <w:pPr>
-              <w:jc w:val="center"/>
-            </w:pPr>
             <w:r>
               <w:rPr>
                 <w:rFonts w:hint="eastAsia"/>
@@ -3044,9 +2678,6 @@
             <w:tcW w:w="1238" w:type="dxa"/>
           </w:tcPr>
           <w:p>
-            <w:pPr>
-              <w:jc w:val="center"/>
-            </w:pPr>
             <w:r>
               <w:rPr>
                 <w:rFonts w:hint="eastAsia"/>
@@ -3063,9 +2694,6 @@
             <w:tcW w:w="1238" w:type="dxa"/>
           </w:tcPr>
           <w:p>
-            <w:pPr>
-              <w:jc w:val="center"/>
-            </w:pPr>
             <w:r>
               <w:rPr>
                 <w:rFonts w:hint="eastAsia"/>
@@ -3082,9 +2710,6 @@
             <w:tcW w:w="1238" w:type="dxa"/>
           </w:tcPr>
           <w:p>
-            <w:pPr>
-              <w:jc w:val="center"/>
-            </w:pPr>
             <w:r>
               <w:rPr>
                 <w:rFonts w:hint="eastAsia"/>
@@ -3101,9 +2726,6 @@
             <w:tcW w:w="1239" w:type="dxa"/>
           </w:tcPr>
           <w:p>
-            <w:pPr>
-              <w:jc w:val="center"/>
-            </w:pPr>
             <w:r>
               <w:rPr>
                 <w:rFonts w:hint="eastAsia"/>
@@ -3120,9 +2742,6 @@
             <w:tcW w:w="1239" w:type="dxa"/>
           </w:tcPr>
           <w:p>
-            <w:pPr>
-              <w:jc w:val="center"/>
-            </w:pPr>
             <w:r>
               <w:rPr>
                 <w:rFonts w:hint="eastAsia"/>
@@ -3141,9 +2760,6 @@
             <w:tcW w:w="876" w:type="dxa"/>
           </w:tcPr>
           <w:p>
-            <w:pPr>
-              <w:jc w:val="center"/>
-            </w:pPr>
             <w:r>
               <w:rPr>
                 <w:rFonts w:hint="eastAsia"/>
@@ -3159,7 +2775,6 @@
           </w:tcPr>
           <w:p>
             <w:pPr>
-              <w:jc w:val="center"/>
               <w:rPr>
                 <w:color w:val="FF0000"/>
               </w:rPr>
@@ -3167,7 +2782,6 @@
             <w:r>
               <w:rPr>
                 <w:rFonts w:hint="eastAsia"/>
-                <w:color w:val="000000" w:themeColor="text1"/>
               </w:rPr>
               <w:t>없음</w:t>
             </w:r>
@@ -3179,19 +2793,9 @@
             <w:shd w:val="clear" w:color="auto" w:fill="000000" w:themeFill="text1"/>
           </w:tcPr>
           <w:p>
-            <w:pPr>
-              <w:jc w:val="center"/>
-              <w:rPr>
-                <w:b/>
-                <w:bCs/>
-              </w:rPr>
-            </w:pPr>
-            <w:r>
-              <w:rPr>
-                <w:rFonts w:hint="eastAsia"/>
-                <w:b/>
-                <w:bCs/>
-                <w:color w:val="FF0000"/>
+            <w:r>
+              <w:rPr>
+                <w:rFonts w:hint="eastAsia"/>
               </w:rPr>
               <w:t>빨강</w:t>
             </w:r>
@@ -3203,20 +2807,9 @@
             <w:shd w:val="clear" w:color="auto" w:fill="000000" w:themeFill="text1"/>
           </w:tcPr>
           <w:p>
-            <w:pPr>
-              <w:jc w:val="center"/>
-              <w:rPr>
-                <w:b/>
-                <w:bCs/>
-                <w:color w:val="00FF00"/>
-              </w:rPr>
-            </w:pPr>
-            <w:r>
-              <w:rPr>
-                <w:rFonts w:hint="eastAsia"/>
-                <w:b/>
-                <w:bCs/>
-                <w:color w:val="00FF00"/>
+            <w:r>
+              <w:rPr>
+                <w:rFonts w:hint="eastAsia"/>
               </w:rPr>
               <w:t>녹색</w:t>
             </w:r>
@@ -3228,19 +2821,9 @@
             <w:shd w:val="clear" w:color="auto" w:fill="000000" w:themeFill="text1"/>
           </w:tcPr>
           <w:p>
-            <w:pPr>
-              <w:jc w:val="center"/>
-              <w:rPr>
-                <w:b/>
-                <w:bCs/>
-              </w:rPr>
-            </w:pPr>
-            <w:r>
-              <w:rPr>
-                <w:rFonts w:hint="eastAsia"/>
-                <w:b/>
-                <w:bCs/>
-                <w:color w:val="FFFF00"/>
+            <w:r>
+              <w:rPr>
+                <w:rFonts w:hint="eastAsia"/>
               </w:rPr>
               <w:t>노랑</w:t>
             </w:r>
@@ -3252,19 +2835,9 @@
             <w:shd w:val="clear" w:color="auto" w:fill="000000" w:themeFill="text1"/>
           </w:tcPr>
           <w:p>
-            <w:pPr>
-              <w:jc w:val="center"/>
-              <w:rPr>
-                <w:b/>
-                <w:bCs/>
-              </w:rPr>
-            </w:pPr>
-            <w:r>
-              <w:rPr>
-                <w:rFonts w:hint="eastAsia"/>
-                <w:b/>
-                <w:bCs/>
-                <w:color w:val="0000FF"/>
+            <w:r>
+              <w:rPr>
+                <w:rFonts w:hint="eastAsia"/>
               </w:rPr>
               <w:t>파랑</w:t>
             </w:r>
@@ -3276,19 +2849,9 @@
             <w:shd w:val="clear" w:color="auto" w:fill="000000" w:themeFill="text1"/>
           </w:tcPr>
           <w:p>
-            <w:pPr>
-              <w:jc w:val="center"/>
-              <w:rPr>
-                <w:b/>
-                <w:bCs/>
-              </w:rPr>
-            </w:pPr>
-            <w:r>
-              <w:rPr>
-                <w:rFonts w:hint="eastAsia"/>
-                <w:b/>
-                <w:bCs/>
-                <w:color w:val="FF00FF"/>
+            <w:r>
+              <w:rPr>
+                <w:rFonts w:hint="eastAsia"/>
               </w:rPr>
               <w:t>분홍</w:t>
             </w:r>
@@ -3300,19 +2863,9 @@
             <w:shd w:val="clear" w:color="auto" w:fill="000000" w:themeFill="text1"/>
           </w:tcPr>
           <w:p>
-            <w:pPr>
-              <w:jc w:val="center"/>
-              <w:rPr>
-                <w:b/>
-                <w:bCs/>
-              </w:rPr>
-            </w:pPr>
-            <w:r>
-              <w:rPr>
-                <w:rFonts w:hint="eastAsia"/>
-                <w:b/>
-                <w:bCs/>
-                <w:color w:val="00FFFF"/>
+            <w:r>
+              <w:rPr>
+                <w:rFonts w:hint="eastAsia"/>
               </w:rPr>
               <w:t>하늘</w:t>
             </w:r>
@@ -3324,18 +2877,9 @@
             <w:shd w:val="clear" w:color="auto" w:fill="000000" w:themeFill="text1"/>
           </w:tcPr>
           <w:p>
-            <w:pPr>
-              <w:jc w:val="center"/>
-              <w:rPr>
-                <w:b/>
-                <w:bCs/>
-              </w:rPr>
-            </w:pPr>
-            <w:r>
-              <w:rPr>
-                <w:rFonts w:hint="eastAsia"/>
-                <w:b/>
-                <w:bCs/>
+            <w:r>
+              <w:rPr>
+                <w:rFonts w:hint="eastAsia"/>
               </w:rPr>
               <w:t>흰색</w:t>
             </w:r>
@@ -3343,6 +2887,130 @@
         </w:tc>
       </w:tr>
     </w:tbl>
+    <w:p>
+      <w:pPr>
+        <w:pStyle w:val="a3"/>
+        <w:numPr>
+          <w:ilvl w:val="0"/>
+          <w:numId w:val="3"/>
+        </w:numPr>
+        <w:ind w:leftChars="0"/>
+      </w:pPr>
+      <w:r>
+        <w:rPr>
+          <w:rFonts w:hint="eastAsia"/>
+        </w:rPr>
+        <w:t>스위치의 상호작용 규칙을 표시하는 힌트 오브젝트를 각 발판에 출력한다.</w:t>
+      </w:r>
+    </w:p>
+    <w:p>
+      <w:pPr>
+        <w:pStyle w:val="a3"/>
+        <w:numPr>
+          <w:ilvl w:val="1"/>
+          <w:numId w:val="3"/>
+        </w:numPr>
+        <w:ind w:leftChars="0"/>
+      </w:pPr>
+      <w:r>
+        <w:rPr>
+          <w:rFonts w:hint="eastAsia"/>
+        </w:rPr>
+        <w:t xml:space="preserve">힌트 오브젝트는 조건 아이콘을 출력하는 </w:t>
+      </w:r>
+      <w:r>
+        <w:t xml:space="preserve">quad </w:t>
+      </w:r>
+      <w:r>
+        <w:rPr>
+          <w:rFonts w:hint="eastAsia"/>
+        </w:rPr>
+        <w:t xml:space="preserve">오브젝트와 효과 색상을 출력하는 </w:t>
+      </w:r>
+      <w:r>
+        <w:t xml:space="preserve">quad </w:t>
+      </w:r>
+      <w:r>
+        <w:rPr>
+          <w:rFonts w:hint="eastAsia"/>
+        </w:rPr>
+        <w:t>오브젝트로 구성된다.</w:t>
+      </w:r>
+    </w:p>
+    <w:p>
+      <w:pPr>
+        <w:pStyle w:val="a3"/>
+        <w:numPr>
+          <w:ilvl w:val="1"/>
+          <w:numId w:val="3"/>
+        </w:numPr>
+        <w:ind w:leftChars="0"/>
+      </w:pPr>
+      <w:r>
+        <w:rPr>
+          <w:rFonts w:hint="eastAsia"/>
+        </w:rPr>
+        <w:t>힌트 오브젝트에 출력되는 효과 색상은 검은색(</w:t>
+      </w:r>
+      <w:r>
+        <w:t xml:space="preserve">false, false, false) </w:t>
+      </w:r>
+      <w:r>
+        <w:rPr>
+          <w:rFonts w:hint="eastAsia"/>
+        </w:rPr>
+        <w:t>상태에서 상호작용 시 변경되는 색상으로 출력된다.</w:t>
+      </w:r>
+    </w:p>
+    <w:p/>
+    <w:p>
+      <w:pPr>
+        <w:pStyle w:val="1"/>
+        <w:numPr>
+          <w:ilvl w:val="0"/>
+          <w:numId w:val="5"/>
+        </w:numPr>
+      </w:pPr>
+      <w:r>
+        <w:rPr>
+          <w:rFonts w:hint="eastAsia"/>
+        </w:rPr>
+        <w:t>다시하기</w:t>
+      </w:r>
+    </w:p>
+    <w:p>
+      <w:pPr>
+        <w:rPr>
+          <w:rFonts w:hint="eastAsia"/>
+        </w:rPr>
+      </w:pPr>
+      <w:r>
+        <w:rPr>
+          <w:rFonts w:hint="eastAsia"/>
+        </w:rPr>
+        <w:t>퍼즐 플레이를 도중에 중단하고 처음부터 다시 진행할 수 있다.</w:t>
+      </w:r>
+    </w:p>
+    <w:p>
+      <w:pPr>
+        <w:pStyle w:val="2"/>
+      </w:pPr>
+      <w:r>
+        <w:t xml:space="preserve">3-1. </w:t>
+      </w:r>
+      <w:r>
+        <w:rPr>
+          <w:rFonts w:hint="eastAsia"/>
+        </w:rPr>
+        <w:t xml:space="preserve">다시하기 </w:t>
+      </w:r>
+      <w:r>
+        <w:rPr>
+          <w:rFonts w:hint="eastAsia"/>
+        </w:rPr>
+        <w:t>기능 설명</w:t>
+      </w:r>
+    </w:p>
     <w:p>
       <w:pPr>
         <w:pStyle w:val="a3"/>
@@ -3357,7 +3025,7 @@
         <w:rPr>
           <w:rFonts w:hint="eastAsia"/>
         </w:rPr>
-        <w:t>스위치의 상호작용 규칙을 표시하는 힌트 오브젝트를 각 발판에 출력한다.</w:t>
+        <w:t>다시하기 기능 사용 시 퍼즐 상태가 초기화 상태로 돌아간다.</w:t>
       </w:r>
     </w:p>
     <w:p>
@@ -3374,25 +3042,7 @@
         <w:rPr>
           <w:rFonts w:hint="eastAsia"/>
         </w:rPr>
-        <w:t xml:space="preserve">힌트 오브젝트는 조건 아이콘을 출력하는 </w:t>
-      </w:r>
-      <w:r>
-        <w:t xml:space="preserve">quad </w:t>
-      </w:r>
-      <w:r>
-        <w:rPr>
-          <w:rFonts w:hint="eastAsia"/>
-        </w:rPr>
-        <w:t xml:space="preserve">오브젝트와 효과 색상을 출력하는 </w:t>
-      </w:r>
-      <w:r>
-        <w:t xml:space="preserve">quad </w:t>
-      </w:r>
-      <w:r>
-        <w:rPr>
-          <w:rFonts w:hint="eastAsia"/>
-        </w:rPr>
-        <w:t>오브젝트로 구성된다.</w:t>
+        <w:t>플레이어 캐릭터의 위치가 시작 발판 위치로 이동된다.</w:t>
       </w:r>
     </w:p>
     <w:p>
@@ -3409,32 +3059,444 @@
         <w:rPr>
           <w:rFonts w:hint="eastAsia"/>
         </w:rPr>
-        <w:t>힌트 오브젝트에 출력되는 효과 색상은 검은색(</w:t>
-      </w:r>
-      <w:r>
-        <w:t xml:space="preserve">false, false, false) </w:t>
-      </w:r>
-      <w:r>
-        <w:rPr>
-          <w:rFonts w:hint="eastAsia"/>
-        </w:rPr>
-        <w:t>상태에서 상호작용 시 변경되는 색상으로 출력된다.</w:t>
+        <w:t>각 발판의 색상이 테이블로 설정된 초기 색상으로 변경된다.</w:t>
       </w:r>
     </w:p>
-    <w:p/>
     <w:p>
       <w:pPr>
+        <w:pStyle w:val="a3"/>
+        <w:numPr>
+          <w:ilvl w:val="0"/>
+          <w:numId w:val="3"/>
+        </w:numPr>
+        <w:wordWrap w:val="0"/>
+        <w:ind w:leftChars="0" w:hanging="403"/>
+      </w:pPr>
+      <w:r>
+        <w:rPr>
+          <w:rFonts w:hint="eastAsia"/>
+        </w:rPr>
+        <w:t>다시하기 코드에 따라 이하의 규칙에 따라</w:t>
+      </w:r>
+      <w:r>
+        <w:t xml:space="preserve"> </w:t>
+      </w:r>
+      <w:r>
+        <w:rPr>
+          <w:rFonts w:hint="eastAsia"/>
+        </w:rPr>
+        <w:t>데이터 값이 계산된다.</w:t>
+      </w:r>
+    </w:p>
+    <w:p>
+      <w:pPr>
+        <w:pStyle w:val="a3"/>
+        <w:numPr>
+          <w:ilvl w:val="1"/>
+          <w:numId w:val="3"/>
+        </w:numPr>
+        <w:wordWrap w:val="0"/>
+        <w:ind w:leftChars="0" w:hanging="403"/>
+      </w:pPr>
+      <w:r>
+        <w:rPr>
+          <w:rFonts w:hint="eastAsia"/>
+        </w:rPr>
+        <w:t>길 연결 퍼즐 구역에 최초 진입 시 현재 상호작용 횟수,</w:t>
+      </w:r>
+      <w:r>
+        <w:t xml:space="preserve"> </w:t>
+      </w:r>
+      <w:r>
+        <w:rPr>
+          <w:rFonts w:hint="eastAsia"/>
+        </w:rPr>
+        <w:t>총 상호작용 횟수,</w:t>
+      </w:r>
+      <w:r>
+        <w:t xml:space="preserve"> </w:t>
+      </w:r>
+      <w:r>
+        <w:rPr>
+          <w:rFonts w:hint="eastAsia"/>
+        </w:rPr>
+        <w:t xml:space="preserve">다시하기 횟수 초기값 </w:t>
+      </w:r>
+      <w:r>
+        <w:t>0</w:t>
+      </w:r>
+      <w:r>
+        <w:rPr>
+          <w:rFonts w:hint="eastAsia"/>
+        </w:rPr>
+        <w:t>이 설정된다.</w:t>
+      </w:r>
+    </w:p>
+    <w:p>
+      <w:pPr>
+        <w:pStyle w:val="a3"/>
+        <w:numPr>
+          <w:ilvl w:val="1"/>
+          <w:numId w:val="3"/>
+        </w:numPr>
+        <w:wordWrap w:val="0"/>
+        <w:ind w:leftChars="0" w:hanging="403"/>
+      </w:pPr>
+      <w:r>
+        <w:rPr>
+          <w:rFonts w:hint="eastAsia"/>
+        </w:rPr>
+        <w:t xml:space="preserve">길 연결 퍼즐에서 발판 스위치와 상호작용 시 현재 상호작용 횟수 및 총 상호작용 횟수가 각각 </w:t>
+      </w:r>
+      <w:r>
+        <w:t>1</w:t>
+      </w:r>
+      <w:r>
+        <w:rPr>
+          <w:rFonts w:hint="eastAsia"/>
+        </w:rPr>
+        <w:t>씩 누적된다.</w:t>
+      </w:r>
+    </w:p>
+    <w:p>
+      <w:pPr>
+        <w:pStyle w:val="a3"/>
+        <w:numPr>
+          <w:ilvl w:val="1"/>
+          <w:numId w:val="3"/>
+        </w:numPr>
+        <w:wordWrap w:val="0"/>
+        <w:ind w:leftChars="0" w:hanging="403"/>
+      </w:pPr>
+      <w:r>
+        <w:rPr>
+          <w:rFonts w:hint="eastAsia"/>
+        </w:rPr>
+        <w:t xml:space="preserve">다시하기 기능 사용 시 플레이어 캐릭터가 시작 발판 위치로 이동한 시점에 현재 상호작용 횟수가 </w:t>
+      </w:r>
+      <w:r>
+        <w:t>0</w:t>
+      </w:r>
+      <w:r>
+        <w:rPr>
+          <w:rFonts w:hint="eastAsia"/>
+        </w:rPr>
+        <w:t>으로 초기화된다.</w:t>
+      </w:r>
+      <w:r>
+        <w:t xml:space="preserve"> (</w:t>
+      </w:r>
+      <w:r>
+        <w:rPr>
+          <w:rFonts w:hint="eastAsia"/>
+        </w:rPr>
+        <w:t>총 상호작용 횟수는 그대로 유지)</w:t>
+      </w:r>
+    </w:p>
+    <w:p>
+      <w:pPr>
+        <w:pStyle w:val="a3"/>
+        <w:numPr>
+          <w:ilvl w:val="1"/>
+          <w:numId w:val="3"/>
+        </w:numPr>
+        <w:wordWrap w:val="0"/>
+        <w:ind w:leftChars="0" w:hanging="403"/>
+      </w:pPr>
+      <w:r>
+        <w:rPr>
+          <w:rFonts w:hint="eastAsia"/>
+        </w:rPr>
+        <w:t xml:space="preserve">다시하기 기능 사용 시 다시하기 횟수가 </w:t>
+      </w:r>
+      <w:r>
+        <w:t xml:space="preserve">1 </w:t>
+      </w:r>
+      <w:r>
+        <w:rPr>
+          <w:rFonts w:hint="eastAsia"/>
+        </w:rPr>
+        <w:t>누적된다.</w:t>
+      </w:r>
+    </w:p>
+    <w:p>
+      <w:pPr>
+        <w:pStyle w:val="a3"/>
+        <w:numPr>
+          <w:ilvl w:val="0"/>
+          <w:numId w:val="3"/>
+        </w:numPr>
+        <w:wordWrap w:val="0"/>
+        <w:ind w:leftChars="0"/>
+      </w:pPr>
+      <w:r>
+        <w:rPr>
+          <w:rFonts w:hint="eastAsia"/>
+        </w:rPr>
+        <w:t xml:space="preserve">플레이어 캐릭터가 도착 지점에 도달하면 데이터 값 누적이 중지된다 </w:t>
+      </w:r>
+      <w:r>
+        <w:t>(</w:t>
+      </w:r>
+      <w:r>
+        <w:rPr>
+          <w:rFonts w:hint="eastAsia"/>
+        </w:rPr>
+        <w:t>이후 엔딩 트리거 포인트로 이동하는 절차만 남게 됨)</w:t>
+      </w:r>
+    </w:p>
+    <w:p>
+      <w:pPr>
+        <w:rPr>
+          <w:rFonts w:hint="eastAsia"/>
+        </w:rPr>
+      </w:pPr>
+    </w:p>
+    <w:p>
+      <w:pPr>
+        <w:pStyle w:val="2"/>
+        <w:rPr>
+          <w:rFonts w:hint="eastAsia"/>
+        </w:rPr>
+      </w:pPr>
+      <w:r>
+        <w:lastRenderedPageBreak/>
+        <w:t>3-</w:t>
+      </w:r>
+      <w:r>
+        <w:t>2</w:t>
+      </w:r>
+      <w:r>
+        <w:t xml:space="preserve">. </w:t>
+      </w:r>
+      <w:r>
+        <w:rPr>
+          <w:rFonts w:hint="eastAsia"/>
+        </w:rPr>
+        <w:t xml:space="preserve">다시하기 </w:t>
+      </w:r>
+      <w:r>
+        <w:t xml:space="preserve">UI </w:t>
+      </w:r>
+      <w:r>
+        <w:rPr>
+          <w:rFonts w:hint="eastAsia"/>
+        </w:rPr>
+        <w:t>동작</w:t>
+      </w:r>
+    </w:p>
+    <w:p>
+      <w:pPr>
+        <w:jc w:val="center"/>
+        <w:rPr>
+          <w:rFonts w:hint="eastAsia"/>
+        </w:rPr>
+      </w:pPr>
+      <w:r>
+        <w:rPr>
+          <w:noProof/>
+        </w:rPr>
+        <w:drawing>
+          <wp:inline distT="0" distB="0" distL="0" distR="0" wp14:anchorId="18220899" wp14:editId="0203402E">
+            <wp:extent cx="5400000" cy="3028634"/>
+            <wp:effectExtent l="0" t="0" r="0" b="635"/>
+            <wp:docPr id="2" name="그림 2"/>
+            <wp:cNvGraphicFramePr>
+              <a:graphicFrameLocks xmlns:a="http://schemas.openxmlformats.org/drawingml/2006/main" noChangeAspect="1"/>
+            </wp:cNvGraphicFramePr>
+            <a:graphic xmlns:a="http://schemas.openxmlformats.org/drawingml/2006/main">
+              <a:graphicData uri="http://schemas.openxmlformats.org/drawingml/2006/picture">
+                <pic:pic xmlns:pic="http://schemas.openxmlformats.org/drawingml/2006/picture">
+                  <pic:nvPicPr>
+                    <pic:cNvPr id="0" name="Picture 2"/>
+                    <pic:cNvPicPr>
+                      <a:picLocks noChangeAspect="1" noChangeArrowheads="1"/>
+                    </pic:cNvPicPr>
+                  </pic:nvPicPr>
+                  <pic:blipFill>
+                    <a:blip r:embed="rId6" cstate="print">
+                      <a:extLst>
+                        <a:ext uri="{28A0092B-C50C-407E-A947-70E740481C1C}">
+                          <a14:useLocalDpi xmlns:a14="http://schemas.microsoft.com/office/drawing/2010/main" val="0"/>
+                        </a:ext>
+                      </a:extLst>
+                    </a:blip>
+                    <a:srcRect/>
+                    <a:stretch>
+                      <a:fillRect/>
+                    </a:stretch>
+                  </pic:blipFill>
+                  <pic:spPr bwMode="auto">
+                    <a:xfrm>
+                      <a:off x="0" y="0"/>
+                      <a:ext cx="5400000" cy="3028634"/>
+                    </a:xfrm>
+                    <a:prstGeom prst="rect">
+                      <a:avLst/>
+                    </a:prstGeom>
+                    <a:noFill/>
+                  </pic:spPr>
+                </pic:pic>
+              </a:graphicData>
+            </a:graphic>
+          </wp:inline>
+        </w:drawing>
+      </w:r>
+    </w:p>
+    <w:p>
+      <w:pPr>
+        <w:pStyle w:val="a3"/>
+        <w:numPr>
+          <w:ilvl w:val="0"/>
+          <w:numId w:val="3"/>
+        </w:numPr>
+        <w:ind w:leftChars="0"/>
+      </w:pPr>
+      <w:r>
+        <w:rPr>
+          <w:rFonts w:hint="eastAsia"/>
+        </w:rPr>
+        <w:t xml:space="preserve">플레이어가 길 연결 퍼즐 영역에 진입 시 </w:t>
+      </w:r>
+      <w:r>
+        <w:t xml:space="preserve">UI </w:t>
+      </w:r>
+      <w:r>
+        <w:rPr>
+          <w:rFonts w:hint="eastAsia"/>
+        </w:rPr>
+        <w:t>캔버스에 다시하기 버튼이 출력된다.</w:t>
+      </w:r>
+    </w:p>
+    <w:p>
+      <w:pPr>
+        <w:jc w:val="center"/>
+        <w:rPr>
+          <w:rFonts w:hint="eastAsia"/>
+        </w:rPr>
+      </w:pPr>
+      <w:r>
+        <w:drawing>
+          <wp:inline distT="0" distB="0" distL="0" distR="0" wp14:anchorId="78C5CFE2" wp14:editId="57C50FF5">
+            <wp:extent cx="4610743" cy="1571844"/>
+            <wp:effectExtent l="0" t="0" r="0" b="9525"/>
+            <wp:docPr id="3" name="그림 3"/>
+            <wp:cNvGraphicFramePr>
+              <a:graphicFrameLocks xmlns:a="http://schemas.openxmlformats.org/drawingml/2006/main" noChangeAspect="1"/>
+            </wp:cNvGraphicFramePr>
+            <a:graphic xmlns:a="http://schemas.openxmlformats.org/drawingml/2006/main">
+              <a:graphicData uri="http://schemas.openxmlformats.org/drawingml/2006/picture">
+                <pic:pic xmlns:pic="http://schemas.openxmlformats.org/drawingml/2006/picture">
+                  <pic:nvPicPr>
+                    <pic:cNvPr id="1" name=""/>
+                    <pic:cNvPicPr/>
+                  </pic:nvPicPr>
+                  <pic:blipFill>
+                    <a:blip r:embed="rId7"/>
+                    <a:stretch>
+                      <a:fillRect/>
+                    </a:stretch>
+                  </pic:blipFill>
+                  <pic:spPr>
+                    <a:xfrm>
+                      <a:off x="0" y="0"/>
+                      <a:ext cx="4610743" cy="1571844"/>
+                    </a:xfrm>
+                    <a:prstGeom prst="rect">
+                      <a:avLst/>
+                    </a:prstGeom>
+                  </pic:spPr>
+                </pic:pic>
+              </a:graphicData>
+            </a:graphic>
+          </wp:inline>
+        </w:drawing>
+      </w:r>
+    </w:p>
+    <w:p>
+      <w:pPr>
+        <w:pStyle w:val="a3"/>
+        <w:numPr>
+          <w:ilvl w:val="0"/>
+          <w:numId w:val="3"/>
+        </w:numPr>
+        <w:ind w:leftChars="0"/>
+      </w:pPr>
+      <w:r>
+        <w:rPr>
+          <w:rFonts w:hint="eastAsia"/>
+        </w:rPr>
+        <w:t xml:space="preserve">다시하기 버튼을 터치하면 다시하기 확인 팝업이 </w:t>
+      </w:r>
+      <w:r>
+        <w:rPr>
+          <w:rFonts w:hint="eastAsia"/>
+        </w:rPr>
+        <w:t>U</w:t>
+      </w:r>
+      <w:r>
+        <w:t xml:space="preserve">I </w:t>
+      </w:r>
+      <w:r>
+        <w:rPr>
+          <w:rFonts w:hint="eastAsia"/>
+        </w:rPr>
+        <w:t xml:space="preserve">캔버스에 </w:t>
+      </w:r>
+      <w:r>
+        <w:rPr>
+          <w:rFonts w:hint="eastAsia"/>
+        </w:rPr>
+        <w:t>출력된다.</w:t>
+      </w:r>
+    </w:p>
+    <w:p>
+      <w:pPr>
+        <w:pStyle w:val="a3"/>
+        <w:numPr>
+          <w:ilvl w:val="1"/>
+          <w:numId w:val="3"/>
+        </w:numPr>
+        <w:ind w:leftChars="0"/>
+      </w:pPr>
+      <w:r>
+        <w:rPr>
+          <w:rFonts w:hint="eastAsia"/>
+        </w:rPr>
+        <w:t>다시하기 확인 팝업에서 취소 버튼을 터치하여 팝업을 닫을 수 있다.</w:t>
+      </w:r>
+    </w:p>
+    <w:p>
+      <w:pPr>
+        <w:pStyle w:val="a3"/>
+        <w:numPr>
+          <w:ilvl w:val="1"/>
+          <w:numId w:val="3"/>
+        </w:numPr>
+        <w:ind w:leftChars="0"/>
+      </w:pPr>
+      <w:r>
+        <w:rPr>
+          <w:rFonts w:hint="eastAsia"/>
+        </w:rPr>
+        <w:t>다시하기 확인 팝업에서 확인 버튼을 터치하여 다시하기 기능을 실행한다.</w:t>
+      </w:r>
+    </w:p>
+    <w:p>
+      <w:pPr>
+        <w:rPr>
+          <w:rFonts w:hint="eastAsia"/>
+        </w:rPr>
+      </w:pPr>
+    </w:p>
+    <w:p>
+      <w:pPr>
         <w:pStyle w:val="1"/>
-      </w:pPr>
-      <w:r>
-        <w:rPr>
-          <w:rFonts w:hint="eastAsia"/>
-        </w:rPr>
-        <w:t>3</w:t>
-      </w:r>
-      <w:r>
-        <w:t xml:space="preserve">. </w:t>
-      </w:r>
+        <w:numPr>
+          <w:ilvl w:val="0"/>
+          <w:numId w:val="5"/>
+        </w:numPr>
+      </w:pPr>
       <w:r>
         <w:rPr>
           <w:rFonts w:hint="eastAsia"/>
@@ -3475,29 +3537,9 @@
             <w:hideMark/>
           </w:tcPr>
           <w:p>
-            <w:pPr>
-              <w:widowControl/>
-              <w:wordWrap/>
-              <w:autoSpaceDE/>
-              <w:autoSpaceDN/>
-              <w:spacing w:after="0" w:line="240" w:lineRule="auto"/>
-              <w:rPr>
-                <w:rFonts w:ascii="맑은 고딕" w:eastAsia="맑은 고딕" w:hAnsi="맑은 고딕" w:cs="Gulim"/>
-                <w:b/>
-                <w:bCs/>
-                <w:color w:val="000000"/>
-                <w:kern w:val="0"/>
-                <w:sz w:val="22"/>
-              </w:rPr>
-            </w:pPr>
-            <w:r>
-              <w:rPr>
-                <w:rFonts w:ascii="맑은 고딕" w:eastAsia="맑은 고딕" w:hAnsi="맑은 고딕" w:cs="Gulim" w:hint="eastAsia"/>
-                <w:b/>
-                <w:bCs/>
-                <w:color w:val="000000"/>
-                <w:kern w:val="0"/>
-                <w:sz w:val="22"/>
+            <w:r>
+              <w:rPr>
+                <w:rFonts w:hint="eastAsia"/>
               </w:rPr>
               <w:t>No.</w:t>
             </w:r>
@@ -3517,30 +3559,10 @@
             <w:hideMark/>
           </w:tcPr>
           <w:p>
-            <w:pPr>
-              <w:widowControl/>
-              <w:wordWrap/>
-              <w:autoSpaceDE/>
-              <w:autoSpaceDN/>
-              <w:spacing w:after="0" w:line="240" w:lineRule="auto"/>
-              <w:rPr>
-                <w:rFonts w:ascii="맑은 고딕" w:eastAsia="맑은 고딕" w:hAnsi="맑은 고딕" w:cs="Gulim"/>
-                <w:b/>
-                <w:bCs/>
-                <w:color w:val="000000"/>
-                <w:kern w:val="0"/>
-                <w:sz w:val="22"/>
-              </w:rPr>
-            </w:pPr>
             <w:proofErr w:type="spellStart"/>
             <w:r>
               <w:rPr>
-                <w:rFonts w:ascii="맑은 고딕" w:eastAsia="맑은 고딕" w:hAnsi="맑은 고딕" w:cs="Gulim" w:hint="eastAsia"/>
-                <w:b/>
-                <w:bCs/>
-                <w:color w:val="000000"/>
-                <w:kern w:val="0"/>
-                <w:sz w:val="22"/>
+                <w:rFonts w:hint="eastAsia"/>
               </w:rPr>
               <w:t>변수명</w:t>
             </w:r>
@@ -3561,29 +3583,9 @@
             <w:hideMark/>
           </w:tcPr>
           <w:p>
-            <w:pPr>
-              <w:widowControl/>
-              <w:wordWrap/>
-              <w:autoSpaceDE/>
-              <w:autoSpaceDN/>
-              <w:spacing w:after="0" w:line="240" w:lineRule="auto"/>
-              <w:rPr>
-                <w:rFonts w:ascii="맑은 고딕" w:eastAsia="맑은 고딕" w:hAnsi="맑은 고딕" w:cs="Gulim"/>
-                <w:b/>
-                <w:bCs/>
-                <w:color w:val="000000"/>
-                <w:kern w:val="0"/>
-                <w:sz w:val="22"/>
-              </w:rPr>
-            </w:pPr>
-            <w:r>
-              <w:rPr>
-                <w:rFonts w:ascii="맑은 고딕" w:eastAsia="맑은 고딕" w:hAnsi="맑은 고딕" w:cs="Gulim" w:hint="eastAsia"/>
-                <w:b/>
-                <w:bCs/>
-                <w:color w:val="000000"/>
-                <w:kern w:val="0"/>
-                <w:sz w:val="22"/>
+            <w:r>
+              <w:rPr>
+                <w:rFonts w:hint="eastAsia"/>
               </w:rPr>
               <w:t>자료형</w:t>
             </w:r>
@@ -3603,29 +3605,9 @@
             <w:hideMark/>
           </w:tcPr>
           <w:p>
-            <w:pPr>
-              <w:widowControl/>
-              <w:wordWrap/>
-              <w:autoSpaceDE/>
-              <w:autoSpaceDN/>
-              <w:spacing w:after="0" w:line="240" w:lineRule="auto"/>
-              <w:rPr>
-                <w:rFonts w:ascii="맑은 고딕" w:eastAsia="맑은 고딕" w:hAnsi="맑은 고딕" w:cs="Gulim"/>
-                <w:b/>
-                <w:bCs/>
-                <w:color w:val="000000"/>
-                <w:kern w:val="0"/>
-                <w:sz w:val="22"/>
-              </w:rPr>
-            </w:pPr>
-            <w:r>
-              <w:rPr>
-                <w:rFonts w:ascii="맑은 고딕" w:eastAsia="맑은 고딕" w:hAnsi="맑은 고딕" w:cs="Gulim" w:hint="eastAsia"/>
-                <w:b/>
-                <w:bCs/>
-                <w:color w:val="000000"/>
-                <w:kern w:val="0"/>
-                <w:sz w:val="22"/>
+            <w:r>
+              <w:rPr>
+                <w:rFonts w:hint="eastAsia"/>
               </w:rPr>
               <w:t>설명</w:t>
             </w:r>
@@ -3650,29 +3632,9 @@
             <w:hideMark/>
           </w:tcPr>
           <w:p>
-            <w:pPr>
-              <w:widowControl/>
-              <w:wordWrap/>
-              <w:autoSpaceDE/>
-              <w:autoSpaceDN/>
-              <w:spacing w:after="0" w:line="240" w:lineRule="auto"/>
-              <w:rPr>
-                <w:rFonts w:ascii="맑은 고딕" w:eastAsia="맑은 고딕" w:hAnsi="맑은 고딕" w:cs="Gulim"/>
-                <w:b/>
-                <w:bCs/>
-                <w:color w:val="000000"/>
-                <w:kern w:val="0"/>
-                <w:szCs w:val="20"/>
-              </w:rPr>
-            </w:pPr>
-            <w:r>
-              <w:rPr>
-                <w:rFonts w:ascii="맑은 고딕" w:eastAsia="맑은 고딕" w:hAnsi="맑은 고딕" w:cs="Gulim" w:hint="eastAsia"/>
-                <w:b/>
-                <w:bCs/>
-                <w:color w:val="000000"/>
-                <w:kern w:val="0"/>
-                <w:szCs w:val="20"/>
+            <w:r>
+              <w:rPr>
+                <w:rFonts w:hint="eastAsia"/>
               </w:rPr>
               <w:t>1</w:t>
             </w:r>
@@ -3692,25 +3654,9 @@
             <w:hideMark/>
           </w:tcPr>
           <w:p>
-            <w:pPr>
-              <w:widowControl/>
-              <w:wordWrap/>
-              <w:autoSpaceDE/>
-              <w:autoSpaceDN/>
-              <w:spacing w:after="0" w:line="240" w:lineRule="auto"/>
-              <w:rPr>
-                <w:rFonts w:ascii="맑은 고딕" w:eastAsia="맑은 고딕" w:hAnsi="맑은 고딕" w:cs="Gulim"/>
-                <w:color w:val="000000"/>
-                <w:kern w:val="0"/>
-                <w:szCs w:val="20"/>
-              </w:rPr>
-            </w:pPr>
-            <w:r>
-              <w:rPr>
-                <w:rFonts w:ascii="맑은 고딕" w:eastAsia="맑은 고딕" w:hAnsi="맑은 고딕" w:cs="Gulim" w:hint="eastAsia"/>
-                <w:color w:val="000000"/>
-                <w:kern w:val="0"/>
-                <w:szCs w:val="20"/>
+            <w:r>
+              <w:rPr>
+                <w:rFonts w:hint="eastAsia"/>
               </w:rPr>
               <w:t>ID</w:t>
             </w:r>
@@ -3730,25 +3676,9 @@
             <w:hideMark/>
           </w:tcPr>
           <w:p>
-            <w:pPr>
-              <w:widowControl/>
-              <w:wordWrap/>
-              <w:autoSpaceDE/>
-              <w:autoSpaceDN/>
-              <w:spacing w:after="0" w:line="240" w:lineRule="auto"/>
-              <w:rPr>
-                <w:rFonts w:ascii="맑은 고딕" w:eastAsia="맑은 고딕" w:hAnsi="맑은 고딕" w:cs="Gulim"/>
-                <w:color w:val="000000"/>
-                <w:kern w:val="0"/>
-                <w:szCs w:val="20"/>
-              </w:rPr>
-            </w:pPr>
-            <w:r>
-              <w:rPr>
-                <w:rFonts w:ascii="맑은 고딕" w:eastAsia="맑은 고딕" w:hAnsi="맑은 고딕" w:cs="Gulim" w:hint="eastAsia"/>
-                <w:color w:val="000000"/>
-                <w:kern w:val="0"/>
-                <w:szCs w:val="20"/>
+            <w:r>
+              <w:rPr>
+                <w:rFonts w:hint="eastAsia"/>
               </w:rPr>
               <w:t>int</w:t>
             </w:r>
@@ -3769,25 +3699,9 @@
             <w:hideMark/>
           </w:tcPr>
           <w:p>
-            <w:pPr>
-              <w:widowControl/>
-              <w:wordWrap/>
-              <w:autoSpaceDE/>
-              <w:autoSpaceDN/>
-              <w:spacing w:after="0" w:line="240" w:lineRule="auto"/>
-              <w:rPr>
-                <w:rFonts w:ascii="맑은 고딕" w:eastAsia="맑은 고딕" w:hAnsi="맑은 고딕" w:cs="Gulim"/>
-                <w:color w:val="000000"/>
-                <w:kern w:val="0"/>
-                <w:szCs w:val="20"/>
-              </w:rPr>
-            </w:pPr>
-            <w:r>
-              <w:rPr>
-                <w:rFonts w:ascii="맑은 고딕" w:eastAsia="맑은 고딕" w:hAnsi="맑은 고딕" w:cs="Gulim" w:hint="eastAsia"/>
-                <w:color w:val="000000"/>
-                <w:kern w:val="0"/>
-                <w:szCs w:val="20"/>
+            <w:r>
+              <w:rPr>
+                <w:rFonts w:hint="eastAsia"/>
               </w:rPr>
               <w:t>각 발판의 고유 ID 번호</w:t>
             </w:r>
@@ -3812,29 +3726,9 @@
             <w:hideMark/>
           </w:tcPr>
           <w:p>
-            <w:pPr>
-              <w:widowControl/>
-              <w:wordWrap/>
-              <w:autoSpaceDE/>
-              <w:autoSpaceDN/>
-              <w:spacing w:after="0" w:line="240" w:lineRule="auto"/>
-              <w:rPr>
-                <w:rFonts w:ascii="맑은 고딕" w:eastAsia="맑은 고딕" w:hAnsi="맑은 고딕" w:cs="Gulim"/>
-                <w:b/>
-                <w:bCs/>
-                <w:color w:val="000000"/>
-                <w:kern w:val="0"/>
-                <w:szCs w:val="20"/>
-              </w:rPr>
-            </w:pPr>
-            <w:r>
-              <w:rPr>
-                <w:rFonts w:ascii="맑은 고딕" w:eastAsia="맑은 고딕" w:hAnsi="맑은 고딕" w:cs="Gulim" w:hint="eastAsia"/>
-                <w:b/>
-                <w:bCs/>
-                <w:color w:val="000000"/>
-                <w:kern w:val="0"/>
-                <w:szCs w:val="20"/>
+            <w:r>
+              <w:rPr>
+                <w:rFonts w:hint="eastAsia"/>
               </w:rPr>
               <w:t>2,3</w:t>
             </w:r>
@@ -3854,25 +3748,9 @@
             <w:hideMark/>
           </w:tcPr>
           <w:p>
-            <w:pPr>
-              <w:widowControl/>
-              <w:wordWrap/>
-              <w:autoSpaceDE/>
-              <w:autoSpaceDN/>
-              <w:spacing w:after="0" w:line="240" w:lineRule="auto"/>
-              <w:rPr>
-                <w:rFonts w:ascii="맑은 고딕" w:eastAsia="맑은 고딕" w:hAnsi="맑은 고딕" w:cs="Gulim"/>
-                <w:color w:val="000000"/>
-                <w:kern w:val="0"/>
-                <w:szCs w:val="20"/>
-              </w:rPr>
-            </w:pPr>
-            <w:r>
-              <w:rPr>
-                <w:rFonts w:ascii="맑은 고딕" w:eastAsia="맑은 고딕" w:hAnsi="맑은 고딕" w:cs="Gulim" w:hint="eastAsia"/>
-                <w:color w:val="000000"/>
-                <w:kern w:val="0"/>
-                <w:szCs w:val="20"/>
+            <w:r>
+              <w:rPr>
+                <w:rFonts w:hint="eastAsia"/>
               </w:rPr>
               <w:t>place</w:t>
             </w:r>
@@ -3892,25 +3770,9 @@
             <w:hideMark/>
           </w:tcPr>
           <w:p>
-            <w:pPr>
-              <w:widowControl/>
-              <w:wordWrap/>
-              <w:autoSpaceDE/>
-              <w:autoSpaceDN/>
-              <w:spacing w:after="0" w:line="240" w:lineRule="auto"/>
-              <w:rPr>
-                <w:rFonts w:ascii="맑은 고딕" w:eastAsia="맑은 고딕" w:hAnsi="맑은 고딕" w:cs="Gulim"/>
-                <w:color w:val="000000"/>
-                <w:kern w:val="0"/>
-                <w:szCs w:val="20"/>
-              </w:rPr>
-            </w:pPr>
-            <w:r>
-              <w:rPr>
-                <w:rFonts w:ascii="맑은 고딕" w:eastAsia="맑은 고딕" w:hAnsi="맑은 고딕" w:cs="Gulim" w:hint="eastAsia"/>
-                <w:color w:val="000000"/>
-                <w:kern w:val="0"/>
-                <w:szCs w:val="20"/>
+            <w:r>
+              <w:rPr>
+                <w:rFonts w:hint="eastAsia"/>
               </w:rPr>
               <w:t>int[2]</w:t>
             </w:r>
@@ -3931,25 +3793,9 @@
             <w:hideMark/>
           </w:tcPr>
           <w:p>
-            <w:pPr>
-              <w:widowControl/>
-              <w:wordWrap/>
-              <w:autoSpaceDE/>
-              <w:autoSpaceDN/>
-              <w:spacing w:after="0" w:line="240" w:lineRule="auto"/>
-              <w:rPr>
-                <w:rFonts w:ascii="맑은 고딕" w:eastAsia="맑은 고딕" w:hAnsi="맑은 고딕" w:cs="Gulim"/>
-                <w:color w:val="000000"/>
-                <w:kern w:val="0"/>
-                <w:szCs w:val="20"/>
-              </w:rPr>
-            </w:pPr>
-            <w:r>
-              <w:rPr>
-                <w:rFonts w:ascii="맑은 고딕" w:eastAsia="맑은 고딕" w:hAnsi="맑은 고딕" w:cs="Gulim" w:hint="eastAsia"/>
-                <w:color w:val="000000"/>
-                <w:kern w:val="0"/>
-                <w:szCs w:val="20"/>
+            <w:r>
+              <w:rPr>
+                <w:rFonts w:hint="eastAsia"/>
               </w:rPr>
               <w:t>각 발판의 위치 값 (x, z좌표)</w:t>
             </w:r>
@@ -3974,29 +3820,9 @@
             <w:hideMark/>
           </w:tcPr>
           <w:p>
-            <w:pPr>
-              <w:widowControl/>
-              <w:wordWrap/>
-              <w:autoSpaceDE/>
-              <w:autoSpaceDN/>
-              <w:spacing w:after="0" w:line="240" w:lineRule="auto"/>
-              <w:rPr>
-                <w:rFonts w:ascii="맑은 고딕" w:eastAsia="맑은 고딕" w:hAnsi="맑은 고딕" w:cs="Gulim"/>
-                <w:b/>
-                <w:bCs/>
-                <w:color w:val="000000"/>
-                <w:kern w:val="0"/>
-                <w:szCs w:val="20"/>
-              </w:rPr>
-            </w:pPr>
-            <w:r>
-              <w:rPr>
-                <w:rFonts w:ascii="맑은 고딕" w:eastAsia="맑은 고딕" w:hAnsi="맑은 고딕" w:cs="Gulim" w:hint="eastAsia"/>
-                <w:b/>
-                <w:bCs/>
-                <w:color w:val="000000"/>
-                <w:kern w:val="0"/>
-                <w:szCs w:val="20"/>
+            <w:r>
+              <w:rPr>
+                <w:rFonts w:hint="eastAsia"/>
               </w:rPr>
               <w:t>4,5,6</w:t>
             </w:r>
@@ -4016,25 +3842,9 @@
             <w:hideMark/>
           </w:tcPr>
           <w:p>
-            <w:pPr>
-              <w:widowControl/>
-              <w:wordWrap/>
-              <w:autoSpaceDE/>
-              <w:autoSpaceDN/>
-              <w:spacing w:after="0" w:line="240" w:lineRule="auto"/>
-              <w:rPr>
-                <w:rFonts w:ascii="맑은 고딕" w:eastAsia="맑은 고딕" w:hAnsi="맑은 고딕" w:cs="Gulim"/>
-                <w:color w:val="000000"/>
-                <w:kern w:val="0"/>
-                <w:szCs w:val="20"/>
-              </w:rPr>
-            </w:pPr>
-            <w:r>
-              <w:rPr>
-                <w:rFonts w:ascii="맑은 고딕" w:eastAsia="맑은 고딕" w:hAnsi="맑은 고딕" w:cs="Gulim" w:hint="eastAsia"/>
-                <w:color w:val="000000"/>
-                <w:kern w:val="0"/>
-                <w:szCs w:val="20"/>
+            <w:r>
+              <w:rPr>
+                <w:rFonts w:hint="eastAsia"/>
               </w:rPr>
               <w:t>color</w:t>
             </w:r>
@@ -4054,25 +3864,9 @@
             <w:hideMark/>
           </w:tcPr>
           <w:p>
-            <w:pPr>
-              <w:widowControl/>
-              <w:wordWrap/>
-              <w:autoSpaceDE/>
-              <w:autoSpaceDN/>
-              <w:spacing w:after="0" w:line="240" w:lineRule="auto"/>
-              <w:rPr>
-                <w:rFonts w:ascii="맑은 고딕" w:eastAsia="맑은 고딕" w:hAnsi="맑은 고딕" w:cs="Gulim"/>
-                <w:color w:val="000000"/>
-                <w:kern w:val="0"/>
-                <w:szCs w:val="20"/>
-              </w:rPr>
-            </w:pPr>
-            <w:r>
-              <w:rPr>
-                <w:rFonts w:ascii="맑은 고딕" w:eastAsia="맑은 고딕" w:hAnsi="맑은 고딕" w:cs="Gulim" w:hint="eastAsia"/>
-                <w:color w:val="000000"/>
-                <w:kern w:val="0"/>
-                <w:szCs w:val="20"/>
+            <w:r>
+              <w:rPr>
+                <w:rFonts w:hint="eastAsia"/>
               </w:rPr>
               <w:t>bool[3]</w:t>
             </w:r>
@@ -4093,25 +3887,9 @@
             <w:hideMark/>
           </w:tcPr>
           <w:p>
-            <w:pPr>
-              <w:widowControl/>
-              <w:wordWrap/>
-              <w:autoSpaceDE/>
-              <w:autoSpaceDN/>
-              <w:spacing w:after="0" w:line="240" w:lineRule="auto"/>
-              <w:rPr>
-                <w:rFonts w:ascii="맑은 고딕" w:eastAsia="맑은 고딕" w:hAnsi="맑은 고딕" w:cs="Gulim"/>
-                <w:color w:val="000000"/>
-                <w:kern w:val="0"/>
-                <w:szCs w:val="20"/>
-              </w:rPr>
-            </w:pPr>
-            <w:r>
-              <w:rPr>
-                <w:rFonts w:ascii="맑은 고딕" w:eastAsia="맑은 고딕" w:hAnsi="맑은 고딕" w:cs="Gulim" w:hint="eastAsia"/>
-                <w:color w:val="000000"/>
-                <w:kern w:val="0"/>
-                <w:szCs w:val="20"/>
+            <w:r>
+              <w:rPr>
+                <w:rFonts w:hint="eastAsia"/>
               </w:rPr>
               <w:t>각 발판의 색상 값 (r, g, b 키)</w:t>
             </w:r>
@@ -4136,29 +3914,9 @@
             <w:hideMark/>
           </w:tcPr>
           <w:p>
-            <w:pPr>
-              <w:widowControl/>
-              <w:wordWrap/>
-              <w:autoSpaceDE/>
-              <w:autoSpaceDN/>
-              <w:spacing w:after="0" w:line="240" w:lineRule="auto"/>
-              <w:rPr>
-                <w:rFonts w:ascii="맑은 고딕" w:eastAsia="맑은 고딕" w:hAnsi="맑은 고딕" w:cs="Gulim"/>
-                <w:b/>
-                <w:bCs/>
-                <w:color w:val="000000"/>
-                <w:kern w:val="0"/>
-                <w:szCs w:val="20"/>
-              </w:rPr>
-            </w:pPr>
-            <w:r>
-              <w:rPr>
-                <w:rFonts w:ascii="맑은 고딕" w:eastAsia="맑은 고딕" w:hAnsi="맑은 고딕" w:cs="Gulim" w:hint="eastAsia"/>
-                <w:b/>
-                <w:bCs/>
-                <w:color w:val="000000"/>
-                <w:kern w:val="0"/>
-                <w:szCs w:val="20"/>
+            <w:r>
+              <w:rPr>
+                <w:rFonts w:hint="eastAsia"/>
               </w:rPr>
               <w:t>7</w:t>
             </w:r>
@@ -4178,26 +3936,10 @@
             <w:hideMark/>
           </w:tcPr>
           <w:p>
-            <w:pPr>
-              <w:widowControl/>
-              <w:wordWrap/>
-              <w:autoSpaceDE/>
-              <w:autoSpaceDN/>
-              <w:spacing w:after="0" w:line="240" w:lineRule="auto"/>
-              <w:rPr>
-                <w:rFonts w:ascii="맑은 고딕" w:eastAsia="맑은 고딕" w:hAnsi="맑은 고딕" w:cs="Gulim"/>
-                <w:color w:val="000000"/>
-                <w:kern w:val="0"/>
-                <w:szCs w:val="20"/>
-              </w:rPr>
-            </w:pPr>
             <w:proofErr w:type="spellStart"/>
             <w:r>
               <w:rPr>
-                <w:rFonts w:ascii="맑은 고딕" w:eastAsia="맑은 고딕" w:hAnsi="맑은 고딕" w:cs="Gulim" w:hint="eastAsia"/>
-                <w:color w:val="000000"/>
-                <w:kern w:val="0"/>
-                <w:szCs w:val="20"/>
+                <w:rFonts w:hint="eastAsia"/>
               </w:rPr>
               <w:t>SwitchCondition</w:t>
             </w:r>
@@ -4218,26 +3960,10 @@
             <w:hideMark/>
           </w:tcPr>
           <w:p>
-            <w:pPr>
-              <w:widowControl/>
-              <w:wordWrap/>
-              <w:autoSpaceDE/>
-              <w:autoSpaceDN/>
-              <w:spacing w:after="0" w:line="240" w:lineRule="auto"/>
-              <w:rPr>
-                <w:rFonts w:ascii="맑은 고딕" w:eastAsia="맑은 고딕" w:hAnsi="맑은 고딕" w:cs="Gulim"/>
-                <w:color w:val="000000"/>
-                <w:kern w:val="0"/>
-                <w:szCs w:val="20"/>
-              </w:rPr>
-            </w:pPr>
             <w:proofErr w:type="spellStart"/>
             <w:r>
               <w:rPr>
-                <w:rFonts w:ascii="맑은 고딕" w:eastAsia="맑은 고딕" w:hAnsi="맑은 고딕" w:cs="Gulim" w:hint="eastAsia"/>
-                <w:color w:val="000000"/>
-                <w:kern w:val="0"/>
-                <w:szCs w:val="20"/>
+                <w:rFonts w:hint="eastAsia"/>
               </w:rPr>
               <w:t>enum</w:t>
             </w:r>
@@ -4258,121 +3984,41 @@
             <w:hideMark/>
           </w:tcPr>
           <w:p>
-            <w:pPr>
-              <w:widowControl/>
-              <w:wordWrap/>
-              <w:autoSpaceDE/>
-              <w:autoSpaceDN/>
-              <w:spacing w:after="0" w:line="240" w:lineRule="auto"/>
-              <w:rPr>
-                <w:rFonts w:ascii="맑은 고딕" w:eastAsia="맑은 고딕" w:hAnsi="맑은 고딕" w:cs="Gulim"/>
-                <w:color w:val="000000"/>
-                <w:kern w:val="0"/>
-                <w:szCs w:val="20"/>
-              </w:rPr>
-            </w:pPr>
-            <w:r>
-              <w:rPr>
-                <w:rFonts w:ascii="맑은 고딕" w:eastAsia="맑은 고딕" w:hAnsi="맑은 고딕" w:cs="Gulim" w:hint="eastAsia"/>
-                <w:color w:val="000000"/>
-                <w:kern w:val="0"/>
-                <w:szCs w:val="20"/>
+            <w:r>
+              <w:rPr>
+                <w:rFonts w:hint="eastAsia"/>
               </w:rPr>
               <w:t>각 발판에 배치되는 스위치의 효과 적용 조건</w:t>
             </w:r>
           </w:p>
           <w:p>
-            <w:pPr>
-              <w:widowControl/>
-              <w:wordWrap/>
-              <w:autoSpaceDE/>
-              <w:autoSpaceDN/>
-              <w:spacing w:after="0" w:line="240" w:lineRule="auto"/>
-              <w:rPr>
-                <w:rFonts w:ascii="맑은 고딕" w:eastAsia="맑은 고딕" w:hAnsi="맑은 고딕" w:cs="Gulim"/>
-                <w:color w:val="000000"/>
-                <w:kern w:val="0"/>
-                <w:szCs w:val="20"/>
-              </w:rPr>
-            </w:pPr>
-            <w:r>
-              <w:rPr>
-                <w:rFonts w:ascii="맑은 고딕" w:eastAsia="맑은 고딕" w:hAnsi="맑은 고딕" w:cs="Gulim" w:hint="eastAsia"/>
-                <w:color w:val="000000"/>
-                <w:kern w:val="0"/>
-                <w:szCs w:val="20"/>
+            <w:r>
+              <w:rPr>
+                <w:rFonts w:hint="eastAsia"/>
               </w:rPr>
               <w:t>near: 이웃한 발판</w:t>
             </w:r>
           </w:p>
           <w:p>
-            <w:pPr>
-              <w:widowControl/>
-              <w:wordWrap/>
-              <w:autoSpaceDE/>
-              <w:autoSpaceDN/>
-              <w:spacing w:after="0" w:line="240" w:lineRule="auto"/>
-              <w:rPr>
-                <w:rFonts w:ascii="맑은 고딕" w:eastAsia="맑은 고딕" w:hAnsi="맑은 고딕" w:cs="Gulim"/>
-                <w:color w:val="000000"/>
-                <w:kern w:val="0"/>
-                <w:szCs w:val="20"/>
-              </w:rPr>
-            </w:pPr>
-            <w:r>
-              <w:rPr>
-                <w:rFonts w:ascii="맑은 고딕" w:eastAsia="맑은 고딕" w:hAnsi="맑은 고딕" w:cs="Gulim" w:hint="eastAsia"/>
-                <w:color w:val="000000"/>
-                <w:kern w:val="0"/>
-                <w:szCs w:val="20"/>
+            <w:r>
+              <w:rPr>
+                <w:rFonts w:hint="eastAsia"/>
               </w:rPr>
               <w:t>row: 가로 번호 같음(같은 세로줄)</w:t>
             </w:r>
           </w:p>
           <w:p>
-            <w:pPr>
-              <w:widowControl/>
-              <w:wordWrap/>
-              <w:autoSpaceDE/>
-              <w:autoSpaceDN/>
-              <w:spacing w:after="0" w:line="240" w:lineRule="auto"/>
-              <w:rPr>
-                <w:rFonts w:ascii="맑은 고딕" w:eastAsia="맑은 고딕" w:hAnsi="맑은 고딕" w:cs="Gulim"/>
-                <w:color w:val="000000"/>
-                <w:kern w:val="0"/>
-                <w:szCs w:val="20"/>
-              </w:rPr>
-            </w:pPr>
-            <w:r>
-              <w:rPr>
-                <w:rFonts w:ascii="맑은 고딕" w:eastAsia="맑은 고딕" w:hAnsi="맑은 고딕" w:cs="Gulim" w:hint="eastAsia"/>
-                <w:color w:val="000000"/>
-                <w:kern w:val="0"/>
-                <w:szCs w:val="20"/>
+            <w:r>
+              <w:rPr>
+                <w:rFonts w:hint="eastAsia"/>
               </w:rPr>
               <w:t>column: 세로 번호 같음(같은 가로줄)</w:t>
             </w:r>
           </w:p>
           <w:p>
-            <w:pPr>
-              <w:widowControl/>
-              <w:wordWrap/>
-              <w:autoSpaceDE/>
-              <w:autoSpaceDN/>
-              <w:spacing w:after="0" w:line="240" w:lineRule="auto"/>
-              <w:rPr>
-                <w:rFonts w:ascii="맑은 고딕" w:eastAsia="맑은 고딕" w:hAnsi="맑은 고딕" w:cs="Gulim"/>
-                <w:color w:val="000000"/>
-                <w:kern w:val="0"/>
-                <w:szCs w:val="20"/>
-              </w:rPr>
-            </w:pPr>
-            <w:r>
-              <w:rPr>
-                <w:rFonts w:ascii="맑은 고딕" w:eastAsia="맑은 고딕" w:hAnsi="맑은 고딕" w:cs="Gulim" w:hint="eastAsia"/>
-                <w:color w:val="000000"/>
-                <w:kern w:val="0"/>
-                <w:szCs w:val="20"/>
+            <w:r>
+              <w:rPr>
+                <w:rFonts w:hint="eastAsia"/>
               </w:rPr>
               <w:t>color: 현재 색상 같음</w:t>
             </w:r>
@@ -4397,29 +4043,9 @@
             <w:hideMark/>
           </w:tcPr>
           <w:p>
-            <w:pPr>
-              <w:widowControl/>
-              <w:wordWrap/>
-              <w:autoSpaceDE/>
-              <w:autoSpaceDN/>
-              <w:spacing w:after="0" w:line="240" w:lineRule="auto"/>
-              <w:rPr>
-                <w:rFonts w:ascii="맑은 고딕" w:eastAsia="맑은 고딕" w:hAnsi="맑은 고딕" w:cs="Gulim"/>
-                <w:b/>
-                <w:bCs/>
-                <w:color w:val="000000"/>
-                <w:kern w:val="0"/>
-                <w:szCs w:val="20"/>
-              </w:rPr>
-            </w:pPr>
-            <w:r>
-              <w:rPr>
-                <w:rFonts w:ascii="맑은 고딕" w:eastAsia="맑은 고딕" w:hAnsi="맑은 고딕" w:cs="Gulim" w:hint="eastAsia"/>
-                <w:b/>
-                <w:bCs/>
-                <w:color w:val="000000"/>
-                <w:kern w:val="0"/>
-                <w:szCs w:val="20"/>
+            <w:r>
+              <w:rPr>
+                <w:rFonts w:hint="eastAsia"/>
               </w:rPr>
               <w:t>8</w:t>
             </w:r>
@@ -4439,26 +4065,10 @@
             <w:hideMark/>
           </w:tcPr>
           <w:p>
-            <w:pPr>
-              <w:widowControl/>
-              <w:wordWrap/>
-              <w:autoSpaceDE/>
-              <w:autoSpaceDN/>
-              <w:spacing w:after="0" w:line="240" w:lineRule="auto"/>
-              <w:rPr>
-                <w:rFonts w:ascii="맑은 고딕" w:eastAsia="맑은 고딕" w:hAnsi="맑은 고딕" w:cs="Gulim"/>
-                <w:color w:val="000000"/>
-                <w:kern w:val="0"/>
-                <w:szCs w:val="20"/>
-              </w:rPr>
-            </w:pPr>
             <w:proofErr w:type="spellStart"/>
             <w:r>
               <w:rPr>
-                <w:rFonts w:ascii="맑은 고딕" w:eastAsia="맑은 고딕" w:hAnsi="맑은 고딕" w:cs="Gulim" w:hint="eastAsia"/>
-                <w:color w:val="000000"/>
-                <w:kern w:val="0"/>
-                <w:szCs w:val="20"/>
+                <w:rFonts w:hint="eastAsia"/>
               </w:rPr>
               <w:t>SwitchValue</w:t>
             </w:r>
@@ -4479,25 +4089,9 @@
             <w:hideMark/>
           </w:tcPr>
           <w:p>
-            <w:pPr>
-              <w:widowControl/>
-              <w:wordWrap/>
-              <w:autoSpaceDE/>
-              <w:autoSpaceDN/>
-              <w:spacing w:after="0" w:line="240" w:lineRule="auto"/>
-              <w:rPr>
-                <w:rFonts w:ascii="맑은 고딕" w:eastAsia="맑은 고딕" w:hAnsi="맑은 고딕" w:cs="Gulim"/>
-                <w:color w:val="000000"/>
-                <w:kern w:val="0"/>
-                <w:szCs w:val="20"/>
-              </w:rPr>
-            </w:pPr>
-            <w:r>
-              <w:rPr>
-                <w:rFonts w:ascii="맑은 고딕" w:eastAsia="맑은 고딕" w:hAnsi="맑은 고딕" w:cs="Gulim" w:hint="eastAsia"/>
-                <w:color w:val="000000"/>
-                <w:kern w:val="0"/>
-                <w:szCs w:val="20"/>
+            <w:r>
+              <w:rPr>
+                <w:rFonts w:hint="eastAsia"/>
               </w:rPr>
               <w:t>int</w:t>
             </w:r>
@@ -4517,117 +4111,47 @@
             <w:hideMark/>
           </w:tcPr>
           <w:p>
-            <w:pPr>
-              <w:widowControl/>
-              <w:wordWrap/>
-              <w:autoSpaceDE/>
-              <w:autoSpaceDN/>
-              <w:spacing w:after="0" w:line="240" w:lineRule="auto"/>
-              <w:rPr>
-                <w:rFonts w:ascii="맑은 고딕" w:eastAsia="맑은 고딕" w:hAnsi="맑은 고딕" w:cs="Gulim"/>
-                <w:color w:val="000000"/>
-                <w:kern w:val="0"/>
-                <w:szCs w:val="20"/>
-              </w:rPr>
-            </w:pPr>
-            <w:r>
-              <w:rPr>
-                <w:rFonts w:ascii="맑은 고딕" w:eastAsia="맑은 고딕" w:hAnsi="맑은 고딕" w:cs="Gulim" w:hint="eastAsia"/>
-                <w:color w:val="000000"/>
-                <w:kern w:val="0"/>
-                <w:szCs w:val="20"/>
+            <w:r>
+              <w:rPr>
+                <w:rFonts w:hint="eastAsia"/>
               </w:rPr>
               <w:t>각 발판 작동 시 효과 적용 값</w:t>
             </w:r>
           </w:p>
           <w:p>
-            <w:pPr>
-              <w:widowControl/>
-              <w:wordWrap/>
-              <w:autoSpaceDE/>
-              <w:autoSpaceDN/>
-              <w:spacing w:after="0" w:line="240" w:lineRule="auto"/>
-              <w:rPr>
-                <w:rFonts w:ascii="맑은 고딕" w:eastAsia="맑은 고딕" w:hAnsi="맑은 고딕" w:cs="Gulim"/>
-                <w:color w:val="000000"/>
-                <w:kern w:val="0"/>
-                <w:szCs w:val="20"/>
-              </w:rPr>
-            </w:pPr>
-            <w:r>
-              <w:rPr>
-                <w:rFonts w:ascii="맑은 고딕" w:eastAsia="맑은 고딕" w:hAnsi="맑은 고딕" w:cs="Gulim" w:hint="eastAsia"/>
-                <w:color w:val="000000"/>
-                <w:kern w:val="0"/>
-                <w:szCs w:val="20"/>
+            <w:r>
+              <w:rPr>
+                <w:rFonts w:hint="eastAsia"/>
               </w:rPr>
               <w:t>* 1,2,4, 순서대로 red/green/blue에 대응되는 비트 값(0~7)</w:t>
             </w:r>
           </w:p>
           <w:p>
-            <w:pPr>
-              <w:widowControl/>
-              <w:wordWrap/>
-              <w:autoSpaceDE/>
-              <w:autoSpaceDN/>
-              <w:spacing w:after="0" w:line="240" w:lineRule="auto"/>
-              <w:rPr>
-                <w:rFonts w:ascii="맑은 고딕" w:eastAsia="맑은 고딕" w:hAnsi="맑은 고딕" w:cs="Gulim"/>
-                <w:color w:val="000000"/>
-                <w:kern w:val="0"/>
-                <w:szCs w:val="20"/>
-              </w:rPr>
-            </w:pPr>
-            <w:r>
-              <w:rPr>
-                <w:rFonts w:ascii="맑은 고딕" w:eastAsia="맑은 고딕" w:hAnsi="맑은 고딕" w:cs="Gulim" w:hint="eastAsia"/>
-                <w:color w:val="000000"/>
-                <w:kern w:val="0"/>
-                <w:szCs w:val="20"/>
+            <w:r>
+              <w:rPr>
+                <w:rFonts w:hint="eastAsia"/>
               </w:rPr>
               <w:t>* 상호작용 시 비트 값 = 1에 해당하는 색상 bool을 0↔1로 반전</w:t>
             </w:r>
           </w:p>
           <w:p>
-            <w:pPr>
-              <w:widowControl/>
-              <w:wordWrap/>
-              <w:autoSpaceDE/>
-              <w:autoSpaceDN/>
-              <w:spacing w:after="0" w:line="240" w:lineRule="auto"/>
-              <w:rPr>
-                <w:rFonts w:ascii="맑은 고딕" w:eastAsia="맑은 고딕" w:hAnsi="맑은 고딕" w:cs="Gulim"/>
-                <w:color w:val="000000"/>
-                <w:kern w:val="0"/>
-                <w:szCs w:val="20"/>
-              </w:rPr>
-            </w:pPr>
-            <w:r>
-              <w:rPr>
-                <w:rFonts w:ascii="맑은 고딕" w:eastAsia="맑은 고딕" w:hAnsi="맑은 고딕" w:cs="Gulim" w:hint="eastAsia"/>
-                <w:color w:val="000000"/>
-                <w:kern w:val="0"/>
-                <w:szCs w:val="20"/>
+            <w:r>
+              <w:rPr>
+                <w:rFonts w:hint="eastAsia"/>
               </w:rPr>
               <w:t xml:space="preserve">* </w:t>
             </w:r>
             <w:proofErr w:type="spellStart"/>
             <w:r>
               <w:rPr>
-                <w:rFonts w:ascii="맑은 고딕" w:eastAsia="맑은 고딕" w:hAnsi="맑은 고딕" w:cs="Gulim" w:hint="eastAsia"/>
-                <w:color w:val="000000"/>
-                <w:kern w:val="0"/>
-                <w:szCs w:val="20"/>
+                <w:rFonts w:hint="eastAsia"/>
               </w:rPr>
               <w:t>SwitchValue</w:t>
             </w:r>
             <w:proofErr w:type="spellEnd"/>
             <w:r>
               <w:rPr>
-                <w:rFonts w:ascii="맑은 고딕" w:eastAsia="맑은 고딕" w:hAnsi="맑은 고딕" w:cs="Gulim" w:hint="eastAsia"/>
-                <w:color w:val="000000"/>
-                <w:kern w:val="0"/>
-                <w:szCs w:val="20"/>
+                <w:rFonts w:hint="eastAsia"/>
               </w:rPr>
               <w:t xml:space="preserve"> = 0(전부 false)인 경우 스위치 비활성화</w:t>
             </w:r>
@@ -4649,6 +4173,95 @@
 <file path=word/numbering.xml><?xml version="1.0" encoding="utf-8"?>
 <w:numbering xmlns:wpc="http://schemas.microsoft.com/office/word/2010/wordprocessingCanvas" xmlns:cx="http://schemas.microsoft.com/office/drawing/2014/chartex" xmlns:cx1="http://schemas.microsoft.com/office/drawing/2015/9/8/chartex" xmlns:cx2="http://schemas.microsoft.com/office/drawing/2015/10/21/chartex" xmlns:cx3="http://schemas.microsoft.com/office/drawing/2016/5/9/chartex" xmlns:cx4="http://schemas.microsoft.com/office/drawing/2016/5/10/chartex" xmlns:cx5="http://schemas.microsoft.com/office/drawing/2016/5/11/chartex" xmlns:cx6="http://schemas.microsoft.com/office/drawing/2016/5/12/chartex" xmlns:cx7="http://schemas.microsoft.com/office/drawing/2016/5/13/chartex" xmlns:cx8="http://schemas.microsoft.com/office/drawing/2016/5/14/chartex" xmlns:mc="http://schemas.openxmlformats.org/markup-compatibility/2006" xmlns:aink="http://schemas.microsoft.com/office/drawing/2016/ink" xmlns:am3d="http://schemas.microsoft.com/office/drawing/2017/model3d" xmlns:o="urn:schemas-microsoft-com:office:office" xmlns:r="http://schemas.openxmlformats.org/officeDocument/2006/relationships" xmlns:m="http://schemas.openxmlformats.org/officeDocument/2006/math" xmlns:v="urn:schemas-microsoft-com:vml" xmlns:wp14="http://schemas.microsoft.com/office/word/2010/wordprocessingDrawing" xmlns:wp="http://schemas.openxmlformats.org/drawingml/2006/wordprocessingDrawing" xmlns:w10="urn:schemas-microsoft-com:office:word" xmlns:w="http://schemas.openxmlformats.org/wordprocessingml/2006/main" xmlns:w14="http://schemas.microsoft.com/office/word/2010/wordml" xmlns:w15="http://schemas.microsoft.com/office/word/2012/wordml" xmlns:w16cex="http://schemas.microsoft.com/office/word/2018/wordml/cex" xmlns:w16cid="http://schemas.microsoft.com/office/word/2016/wordml/cid" xmlns:w16="http://schemas.microsoft.com/office/word/2018/wordml" xmlns:w16sdtdh="http://schemas.microsoft.com/office/word/2020/wordml/sdtdatahash" xmlns:w16se="http://schemas.microsoft.com/office/word/2015/wordml/symex" xmlns:wpg="http://schemas.microsoft.com/office/word/2010/wordprocessingGroup" xmlns:wpi="http://schemas.microsoft.com/office/word/2010/wordprocessingInk" xmlns:wne="http://schemas.microsoft.com/office/word/2006/wordml" xmlns:wps="http://schemas.microsoft.com/office/word/2010/wordprocessingShape" mc:Ignorable="w14 w15 w16se w16cid w16 w16cex w16sdtdh wp14">
   <w:abstractNum w:abstractNumId="0" w15:restartNumberingAfterBreak="0">
+    <w:nsid w:val="0F0A2601"/>
+    <w:multiLevelType w:val="hybridMultilevel"/>
+    <w:tmpl w:val="60BA43D6"/>
+    <w:lvl w:ilvl="0" w:tplc="AF1A15CA">
+      <w:start w:val="1"/>
+      <w:numFmt w:val="decimal"/>
+      <w:lvlText w:val="%1."/>
+      <w:lvlJc w:val="left"/>
+      <w:pPr>
+        <w:ind w:left="760" w:hanging="360"/>
+      </w:pPr>
+      <w:rPr>
+        <w:rFonts w:hint="default"/>
+      </w:rPr>
+    </w:lvl>
+    <w:lvl w:ilvl="1" w:tplc="04090019" w:tentative="1">
+      <w:start w:val="1"/>
+      <w:numFmt w:val="upperLetter"/>
+      <w:lvlText w:val="%2."/>
+      <w:lvlJc w:val="left"/>
+      <w:pPr>
+        <w:ind w:left="1200" w:hanging="400"/>
+      </w:pPr>
+    </w:lvl>
+    <w:lvl w:ilvl="2" w:tplc="0409001B" w:tentative="1">
+      <w:start w:val="1"/>
+      <w:numFmt w:val="lowerRoman"/>
+      <w:lvlText w:val="%3."/>
+      <w:lvlJc w:val="right"/>
+      <w:pPr>
+        <w:ind w:left="1600" w:hanging="400"/>
+      </w:pPr>
+    </w:lvl>
+    <w:lvl w:ilvl="3" w:tplc="0409000F" w:tentative="1">
+      <w:start w:val="1"/>
+      <w:numFmt w:val="decimal"/>
+      <w:lvlText w:val="%4."/>
+      <w:lvlJc w:val="left"/>
+      <w:pPr>
+        <w:ind w:left="2000" w:hanging="400"/>
+      </w:pPr>
+    </w:lvl>
+    <w:lvl w:ilvl="4" w:tplc="04090019" w:tentative="1">
+      <w:start w:val="1"/>
+      <w:numFmt w:val="upperLetter"/>
+      <w:lvlText w:val="%5."/>
+      <w:lvlJc w:val="left"/>
+      <w:pPr>
+        <w:ind w:left="2400" w:hanging="400"/>
+      </w:pPr>
+    </w:lvl>
+    <w:lvl w:ilvl="5" w:tplc="0409001B" w:tentative="1">
+      <w:start w:val="1"/>
+      <w:numFmt w:val="lowerRoman"/>
+      <w:lvlText w:val="%6."/>
+      <w:lvlJc w:val="right"/>
+      <w:pPr>
+        <w:ind w:left="2800" w:hanging="400"/>
+      </w:pPr>
+    </w:lvl>
+    <w:lvl w:ilvl="6" w:tplc="0409000F" w:tentative="1">
+      <w:start w:val="1"/>
+      <w:numFmt w:val="decimal"/>
+      <w:lvlText w:val="%7."/>
+      <w:lvlJc w:val="left"/>
+      <w:pPr>
+        <w:ind w:left="3200" w:hanging="400"/>
+      </w:pPr>
+    </w:lvl>
+    <w:lvl w:ilvl="7" w:tplc="04090019" w:tentative="1">
+      <w:start w:val="1"/>
+      <w:numFmt w:val="upperLetter"/>
+      <w:lvlText w:val="%8."/>
+      <w:lvlJc w:val="left"/>
+      <w:pPr>
+        <w:ind w:left="3600" w:hanging="400"/>
+      </w:pPr>
+    </w:lvl>
+    <w:lvl w:ilvl="8" w:tplc="0409001B" w:tentative="1">
+      <w:start w:val="1"/>
+      <w:numFmt w:val="lowerRoman"/>
+      <w:lvlText w:val="%9."/>
+      <w:lvlJc w:val="right"/>
+      <w:pPr>
+        <w:ind w:left="4000" w:hanging="400"/>
+      </w:pPr>
+    </w:lvl>
+  </w:abstractNum>
+  <w:abstractNum w:abstractNumId="1" w15:restartNumberingAfterBreak="0">
     <w:nsid w:val="27FD4706"/>
     <w:multiLevelType w:val="hybridMultilevel"/>
     <w:tmpl w:val="A4562042"/>
@@ -4760,7 +4373,7 @@
       </w:rPr>
     </w:lvl>
   </w:abstractNum>
-  <w:abstractNum w:abstractNumId="1" w15:restartNumberingAfterBreak="0">
+  <w:abstractNum w:abstractNumId="2" w15:restartNumberingAfterBreak="0">
     <w:nsid w:val="2EC15015"/>
     <w:multiLevelType w:val="hybridMultilevel"/>
     <w:tmpl w:val="10E8D2AE"/>
@@ -4873,7 +4486,7 @@
       </w:rPr>
     </w:lvl>
   </w:abstractNum>
-  <w:abstractNum w:abstractNumId="2" w15:restartNumberingAfterBreak="0">
+  <w:abstractNum w:abstractNumId="3" w15:restartNumberingAfterBreak="0">
     <w:nsid w:val="63E05D4D"/>
     <w:multiLevelType w:val="hybridMultilevel"/>
     <w:tmpl w:val="4E0ED16A"/>
@@ -4986,14 +4599,106 @@
       </w:rPr>
     </w:lvl>
   </w:abstractNum>
+  <w:abstractNum w:abstractNumId="4" w15:restartNumberingAfterBreak="0">
+    <w:nsid w:val="7D156007"/>
+    <w:multiLevelType w:val="hybridMultilevel"/>
+    <w:tmpl w:val="9500B386"/>
+    <w:lvl w:ilvl="0" w:tplc="0409000F">
+      <w:start w:val="1"/>
+      <w:numFmt w:val="decimal"/>
+      <w:lvlText w:val="%1."/>
+      <w:lvlJc w:val="left"/>
+      <w:pPr>
+        <w:ind w:left="800" w:hanging="400"/>
+      </w:pPr>
+    </w:lvl>
+    <w:lvl w:ilvl="1" w:tplc="04090019" w:tentative="1">
+      <w:start w:val="1"/>
+      <w:numFmt w:val="upperLetter"/>
+      <w:lvlText w:val="%2."/>
+      <w:lvlJc w:val="left"/>
+      <w:pPr>
+        <w:ind w:left="1200" w:hanging="400"/>
+      </w:pPr>
+    </w:lvl>
+    <w:lvl w:ilvl="2" w:tplc="0409001B" w:tentative="1">
+      <w:start w:val="1"/>
+      <w:numFmt w:val="lowerRoman"/>
+      <w:lvlText w:val="%3."/>
+      <w:lvlJc w:val="right"/>
+      <w:pPr>
+        <w:ind w:left="1600" w:hanging="400"/>
+      </w:pPr>
+    </w:lvl>
+    <w:lvl w:ilvl="3" w:tplc="0409000F" w:tentative="1">
+      <w:start w:val="1"/>
+      <w:numFmt w:val="decimal"/>
+      <w:lvlText w:val="%4."/>
+      <w:lvlJc w:val="left"/>
+      <w:pPr>
+        <w:ind w:left="2000" w:hanging="400"/>
+      </w:pPr>
+    </w:lvl>
+    <w:lvl w:ilvl="4" w:tplc="04090019" w:tentative="1">
+      <w:start w:val="1"/>
+      <w:numFmt w:val="upperLetter"/>
+      <w:lvlText w:val="%5."/>
+      <w:lvlJc w:val="left"/>
+      <w:pPr>
+        <w:ind w:left="2400" w:hanging="400"/>
+      </w:pPr>
+    </w:lvl>
+    <w:lvl w:ilvl="5" w:tplc="0409001B" w:tentative="1">
+      <w:start w:val="1"/>
+      <w:numFmt w:val="lowerRoman"/>
+      <w:lvlText w:val="%6."/>
+      <w:lvlJc w:val="right"/>
+      <w:pPr>
+        <w:ind w:left="2800" w:hanging="400"/>
+      </w:pPr>
+    </w:lvl>
+    <w:lvl w:ilvl="6" w:tplc="0409000F" w:tentative="1">
+      <w:start w:val="1"/>
+      <w:numFmt w:val="decimal"/>
+      <w:lvlText w:val="%7."/>
+      <w:lvlJc w:val="left"/>
+      <w:pPr>
+        <w:ind w:left="3200" w:hanging="400"/>
+      </w:pPr>
+    </w:lvl>
+    <w:lvl w:ilvl="7" w:tplc="04090019" w:tentative="1">
+      <w:start w:val="1"/>
+      <w:numFmt w:val="upperLetter"/>
+      <w:lvlText w:val="%8."/>
+      <w:lvlJc w:val="left"/>
+      <w:pPr>
+        <w:ind w:left="3600" w:hanging="400"/>
+      </w:pPr>
+    </w:lvl>
+    <w:lvl w:ilvl="8" w:tplc="0409001B" w:tentative="1">
+      <w:start w:val="1"/>
+      <w:numFmt w:val="lowerRoman"/>
+      <w:lvlText w:val="%9."/>
+      <w:lvlJc w:val="right"/>
+      <w:pPr>
+        <w:ind w:left="4000" w:hanging="400"/>
+      </w:pPr>
+    </w:lvl>
+  </w:abstractNum>
   <w:num w:numId="1">
-    <w:abstractNumId w:val="0"/>
+    <w:abstractNumId w:val="1"/>
   </w:num>
   <w:num w:numId="2">
-    <w:abstractNumId w:val="1"/>
+    <w:abstractNumId w:val="2"/>
   </w:num>
   <w:num w:numId="3">
-    <w:abstractNumId w:val="2"/>
+    <w:abstractNumId w:val="3"/>
+  </w:num>
+  <w:num w:numId="4">
+    <w:abstractNumId w:val="4"/>
+  </w:num>
+  <w:num w:numId="5">
+    <w:abstractNumId w:val="0"/>
   </w:num>
 </w:numbering>
 </file>
@@ -5397,13 +5102,13 @@
   <w:style w:type="paragraph" w:default="1" w:styleId="a">
     <w:name w:val="Normal"/>
     <w:qFormat/>
-    <w:rsid w:val="00C429BC"/>
+    <w:rsid w:val="005A3217"/>
     <w:pPr>
       <w:widowControl w:val="0"/>
       <w:wordWrap w:val="0"/>
       <w:autoSpaceDE w:val="0"/>
       <w:autoSpaceDN w:val="0"/>
-      <w:spacing w:line="256" w:lineRule="auto"/>
+      <w:spacing w:after="0" w:line="240" w:lineRule="auto"/>
     </w:pPr>
   </w:style>
   <w:style w:type="paragraph" w:styleId="1">
@@ -5416,7 +5121,6 @@
     <w:rsid w:val="00C429BC"/>
     <w:pPr>
       <w:keepNext/>
-      <w:spacing w:after="0"/>
       <w:outlineLvl w:val="0"/>
     </w:pPr>
     <w:rPr>
@@ -5436,7 +5140,6 @@
     <w:rsid w:val="00A96D4D"/>
     <w:pPr>
       <w:keepNext/>
-      <w:spacing w:after="0"/>
       <w:outlineLvl w:val="1"/>
     </w:pPr>
     <w:rPr>
@@ -5458,7 +5161,6 @@
     <w:rsid w:val="00F80B9E"/>
     <w:pPr>
       <w:keepNext/>
-      <w:spacing w:after="0"/>
       <w:ind w:leftChars="300" w:left="1040" w:hangingChars="200" w:hanging="440"/>
       <w:outlineLvl w:val="2"/>
     </w:pPr>
@@ -5508,7 +5210,6 @@
       <w:wordWrap/>
       <w:autoSpaceDE/>
       <w:autoSpaceDN/>
-      <w:spacing w:after="0" w:line="240" w:lineRule="auto"/>
       <w:ind w:leftChars="400" w:left="800"/>
     </w:pPr>
   </w:style>

</xml_diff>